<commit_message>
Major revision: bootstrap CI, cross-model agreement, downstream task
- Bootstrap CI (10K iter): top-6 dims significantly above null
- Cross-model agreement (DeepSeek vs Gemini): dim 63%, polarity 84%
- Downstream task: dimension-aware highlight detection
- Silhouette analysis for k selection (k=11 optimal)
- Related work: distinguish from Understanding Virality (top-down VLM)
- Honest permutation test reporting
- Updated abstract, contributions, limitations
</commit_message>
<xml_diff>
--- a/paper/paper.docx
+++ b/paper/paper.docx
@@ -2,7 +2,7 @@
 <file path=word/document.xml><?xml version="1.0" encoding="utf-8"?>
 <w:document xmlns:w="http://schemas.openxmlformats.org/wordprocessingml/2006/main" xmlns:m="http://schemas.openxmlformats.org/officeDocument/2006/math" xmlns:r="http://schemas.openxmlformats.org/officeDocument/2006/relationships" xmlns:o="urn:schemas-microsoft-com:office:office" xmlns:v="urn:schemas-microsoft-com:vml" xmlns:w10="urn:schemas-microsoft-com:office:word" xmlns:a="http://schemas.openxmlformats.org/drawingml/2006/main" xmlns:pic="http://schemas.openxmlformats.org/drawingml/2006/picture" xmlns:wp="http://schemas.openxmlformats.org/drawingml/2006/wordprocessingDrawing">
   <w:body>
-    <w:bookmarkStart w:id="56" w:name="Xc43ddaf119bbe309d124527fb9228d1aa7df3ff"/>
+    <w:bookmarkStart w:id="59" w:name="Xc43ddaf119bbe309d124527fb9228d1aa7df3ff"/>
     <w:p>
       <w:pPr>
         <w:pStyle w:val="Heading1"/>
@@ -37,14 +37,14 @@
         <w:pStyle w:val="FirstParagraph"/>
       </w:pPr>
       <w:r>
-        <w:t xml:space="preserve">We show that natural audience evaluations (e.g., real-time video comments/danmaku) contain sufficient semantic structure to automatically discover meaningful content dimensions—without any human-defined labels or feature engineering. By clustering the semantic embeddings of evaluative comments and aligning them with temporal content, we demonstrate that: (1) 9 interpretable evaluation dimensions emerge automatically (plot, acting, visuals, music, pacing, etc.), stable across videos; (2) these dimensions temporally align with specific content segments (entropy 0.01–0.46 vs. 1.0 expected for random); (3) the temporal distribution pattern of dimensions serves as a content-type fingerprint (suspense dramas show dispersed plot discussion; film analyses show concentrated plot peaks). Our findings establish a new paradigm—</w:t>
+        <w:t xml:space="preserve">We show that natural audience evaluations (e.g., real-time video comments/danmaku) contain sufficient semantic structure to automatically discover meaningful content dimensions—without any human-defined labels or feature engineering. By clustering the semantic embeddings of evaluative comments and aligning them with temporal content, we demonstrate that: (1) 9 interpretable evaluation dimensions emerge automatically (plot, acting, visuals, music, pacing, etc.); (2) the top 6 dimensions recur stably across 16 videos and 3 genres, with bootstrap 95% confidence intervals significantly above a random-assignment null model; (3) two architecturally distinct models (DeepSeek and Gemini) independently agree on dimension labels (63%, 5.7× chance) and polarity (84%), confirming the dimensions are model-independent; (4) dimensions temporally concentrate at content-specific moments and enable downstream applications such as explainable highlight detection. Our findings establish a new paradigm—</w:t>
       </w:r>
       <w:r>
         <w:rPr>
           <w:b/>
           <w:bCs/>
         </w:rPr>
-        <w:t xml:space="preserve">Evaluation-Driven Representation Learning</w:t>
+        <w:t xml:space="preserve">Evaluation-Driven Representation Learning (EDRL)</w:t>
       </w:r>
       <w:r>
         <w:t xml:space="preserve">—where natural human evaluations, rather than engineered labels, drive the discovery of content structure.</w:t>
@@ -160,7 +160,7 @@
         </w:numPr>
       </w:pPr>
       <w:r>
-        <w:t xml:space="preserve">We show these dimensions temporally align with specific content segments, with concentration metrics (normalized entropy 0.01–0.55) far below random expectation.</w:t>
+        <w:t xml:space="preserve">We statistically validate cross-video stability: the top 6 dimensions have bootstrap 95% CIs above a random-assignment null model across 16 videos and 3 genres.</w:t>
       </w:r>
     </w:p>
     <w:p>
@@ -172,7 +172,7 @@
         </w:numPr>
       </w:pPr>
       <w:r>
-        <w:t xml:space="preserve">We establish that dimension distributions differ systematically by content type, serving as content fingerprints.</w:t>
+        <w:t xml:space="preserve">We confirm model-independence via cross-architecture agreement: DeepSeek and Gemini independently agree on dimensions (63%, 5.7× chance) and polarity (84%).</w:t>
       </w:r>
     </w:p>
     <w:p>
@@ -184,7 +184,7 @@
         </w:numPr>
       </w:pPr>
       <w:r>
-        <w:t xml:space="preserve">We validate cross-video stability: core dimensions (plot, acting, visuals) recur across different videos and genres.</w:t>
+        <w:t xml:space="preserve">We show dimensions temporally concentrate at content-specific moments and enable a downstream task—explainable highlight detection (where + why).</w:t>
       </w:r>
     </w:p>
     <w:p>
@@ -258,7 +258,7 @@
     </w:p>
     <w:bookmarkEnd w:id="11"/>
     <w:bookmarkEnd w:id="12"/>
-    <w:bookmarkStart w:id="17" w:name="related-work"/>
+    <w:bookmarkStart w:id="18" w:name="related-work"/>
     <w:p>
       <w:pPr>
         <w:pStyle w:val="Heading2"/>
@@ -466,6 +466,185 @@
         <w:t xml:space="preserve">Gap: These don’t link discovered dimensions to temporal content features</w:t>
       </w:r>
     </w:p>
+    <w:bookmarkEnd w:id="16"/>
+    <w:bookmarkStart w:id="17" w:name="X89817649f1ca74880199734249a890a2a89d181"/>
+    <w:p>
+      <w:pPr>
+        <w:pStyle w:val="Heading3"/>
+      </w:pPr>
+      <w:r>
+        <w:t xml:space="preserve">2.5 Closest Work: VLM-Based Content Factor Discovery</w:t>
+      </w:r>
+    </w:p>
+    <w:p>
+      <w:pPr>
+        <w:pStyle w:val="FirstParagraph"/>
+      </w:pPr>
+      <w:r>
+        <w:t xml:space="preserve">The most related recent work is</w:t>
+      </w:r>
+      <w:r>
+        <w:t xml:space="preserve"> </w:t>
+      </w:r>
+      <w:r>
+        <w:t xml:space="preserve">“Understanding Virality”</w:t>
+      </w:r>
+      <w:r>
+        <w:t xml:space="preserve"> </w:t>
+      </w:r>
+      <w:r>
+        <w:t xml:space="preserve">(2025), which uses Vision-Language Models to extract audiovisual features from short videos, clusters them into interpretable factors, and predicts virality. The key distinction is</w:t>
+      </w:r>
+      <w:r>
+        <w:t xml:space="preserve"> </w:t>
+      </w:r>
+      <w:r>
+        <w:rPr>
+          <w:b/>
+          <w:bCs/>
+        </w:rPr>
+        <w:t xml:space="preserve">direction of inference</w:t>
+      </w:r>
+      <w:r>
+        <w:t xml:space="preserve">:</w:t>
+      </w:r>
+      <w:r>
+        <w:t xml:space="preserve"> </w:t>
+      </w:r>
+      <w:r>
+        <w:t xml:space="preserve">-</w:t>
+      </w:r>
+      <w:r>
+        <w:t xml:space="preserve"> </w:t>
+      </w:r>
+      <w:r>
+        <w:rPr>
+          <w:b/>
+          <w:bCs/>
+        </w:rPr>
+        <w:t xml:space="preserve">Understanding Virality (top-down):</w:t>
+      </w:r>
+      <w:r>
+        <w:t xml:space="preserve"> </w:t>
+      </w:r>
+      <w:r>
+        <w:t xml:space="preserve">A model</w:t>
+      </w:r>
+      <w:r>
+        <w:t xml:space="preserve"> </w:t>
+      </w:r>
+      <w:r>
+        <w:rPr>
+          <w:i/>
+          <w:iCs/>
+        </w:rPr>
+        <w:t xml:space="preserve">watches the video</w:t>
+      </w:r>
+      <w:r>
+        <w:t xml:space="preserve"> </w:t>
+      </w:r>
+      <w:r>
+        <w:t xml:space="preserve">and extracts content features. Dimensions reflect</w:t>
+      </w:r>
+      <w:r>
+        <w:t xml:space="preserve"> </w:t>
+      </w:r>
+      <w:r>
+        <w:rPr>
+          <w:i/>
+          <w:iCs/>
+        </w:rPr>
+        <w:t xml:space="preserve">model perception</w:t>
+      </w:r>
+      <w:r>
+        <w:t xml:space="preserve">.</w:t>
+      </w:r>
+      <w:r>
+        <w:t xml:space="preserve"> </w:t>
+      </w:r>
+      <w:r>
+        <w:t xml:space="preserve">-</w:t>
+      </w:r>
+      <w:r>
+        <w:t xml:space="preserve"> </w:t>
+      </w:r>
+      <w:r>
+        <w:rPr>
+          <w:b/>
+          <w:bCs/>
+        </w:rPr>
+        <w:t xml:space="preserve">EDRL (bottom-up):</w:t>
+      </w:r>
+      <w:r>
+        <w:t xml:space="preserve"> </w:t>
+      </w:r>
+      <w:r>
+        <w:t xml:space="preserve">We infer dimensions from</w:t>
+      </w:r>
+      <w:r>
+        <w:t xml:space="preserve"> </w:t>
+      </w:r>
+      <w:r>
+        <w:rPr>
+          <w:i/>
+          <w:iCs/>
+        </w:rPr>
+        <w:t xml:space="preserve">audience reactions</w:t>
+      </w:r>
+      <w:r>
+        <w:t xml:space="preserve">. Dimensions reflect</w:t>
+      </w:r>
+      <w:r>
+        <w:t xml:space="preserve"> </w:t>
+      </w:r>
+      <w:r>
+        <w:rPr>
+          <w:i/>
+          <w:iCs/>
+        </w:rPr>
+        <w:t xml:space="preserve">human perception</w:t>
+      </w:r>
+      <w:r>
+        <w:t xml:space="preserve">—what viewers actually notice and judge.</w:t>
+      </w:r>
+    </w:p>
+    <w:p>
+      <w:pPr>
+        <w:pStyle w:val="BodyText"/>
+      </w:pPr>
+      <w:r>
+        <w:t xml:space="preserve">These are complementary: model-extracted factors capture what</w:t>
+      </w:r>
+      <w:r>
+        <w:t xml:space="preserve"> </w:t>
+      </w:r>
+      <w:r>
+        <w:rPr>
+          <w:i/>
+          <w:iCs/>
+        </w:rPr>
+        <w:t xml:space="preserve">is</w:t>
+      </w:r>
+      <w:r>
+        <w:t xml:space="preserve"> </w:t>
+      </w:r>
+      <w:r>
+        <w:t xml:space="preserve">in the content; evaluation-driven dimensions capture what</w:t>
+      </w:r>
+      <w:r>
+        <w:t xml:space="preserve"> </w:t>
+      </w:r>
+      <w:r>
+        <w:rPr>
+          <w:i/>
+          <w:iCs/>
+        </w:rPr>
+        <w:t xml:space="preserve">audiences respond to</w:t>
+      </w:r>
+      <w:r>
+        <w:t xml:space="preserve">. The two may diverge (e.g., a subtle visual detail a VLM extracts but no viewer comments on, vs. a plot point that dominates discussion but is visually unremarkable).</w:t>
+      </w:r>
+    </w:p>
     <w:p>
       <w:r>
         <w:pict>
@@ -473,9 +652,9 @@
         </w:pict>
       </w:r>
     </w:p>
-    <w:bookmarkEnd w:id="16"/>
     <w:bookmarkEnd w:id="17"/>
-    <w:bookmarkStart w:id="26" w:name="Xcebf56e959b784cb9a3eb005da55dc7896de8cc"/>
+    <w:bookmarkEnd w:id="18"/>
+    <w:bookmarkStart w:id="27" w:name="Xcebf56e959b784cb9a3eb005da55dc7896de8cc"/>
     <w:p>
       <w:pPr>
         <w:pStyle w:val="Heading2"/>
@@ -493,18 +672,18 @@
           <wp:inline>
             <wp:extent cx="5334000" cy="1562484"/>
             <wp:effectExtent b="0" l="0" r="0" t="0"/>
-            <wp:docPr descr="EDRL Pipeline: From raw comments to named dimensions with temporal alignment" title="" id="19" name="Picture"/>
+            <wp:docPr descr="EDRL Pipeline: From raw comments to named dimensions with temporal alignment" title="" id="20" name="Picture"/>
             <a:graphic>
               <a:graphicData uri="http://schemas.openxmlformats.org/drawingml/2006/picture">
                 <pic:pic>
                   <pic:nvPicPr>
-                    <pic:cNvPr descr="figures/fig1_pipeline.png" id="20" name="Picture"/>
+                    <pic:cNvPr descr="figures/fig1_pipeline.png" id="21" name="Picture"/>
                     <pic:cNvPicPr>
                       <a:picLocks noChangeArrowheads="1" noChangeAspect="1"/>
                     </pic:cNvPicPr>
                   </pic:nvPicPr>
                   <pic:blipFill>
-                    <a:blip r:embed="rId18"/>
+                    <a:blip r:embed="rId19"/>
                     <a:stretch>
                       <a:fillRect/>
                     </a:stretch>
@@ -539,7 +718,7 @@
         <w:t xml:space="preserve">EDRL Pipeline: From raw comments to named dimensions with temporal alignment</w:t>
       </w:r>
     </w:p>
-    <w:bookmarkStart w:id="21" w:name="data-collection"/>
+    <w:bookmarkStart w:id="22" w:name="data-collection"/>
     <w:p>
       <w:pPr>
         <w:pStyle w:val="Heading3"/>
@@ -596,8 +775,8 @@
         <w:t xml:space="preserve">Raw data: timestamped comments, 600–9600 per video, ~30,000 total</w:t>
       </w:r>
     </w:p>
-    <w:bookmarkEnd w:id="21"/>
-    <w:bookmarkStart w:id="22" w:name="filtering-pipeline"/>
+    <w:bookmarkEnd w:id="22"/>
+    <w:bookmarkStart w:id="23" w:name="filtering-pipeline"/>
     <w:p>
       <w:pPr>
         <w:pStyle w:val="Heading3"/>
@@ -644,8 +823,8 @@
         <w:t xml:space="preserve">: LLM judges whether each comment evaluates content quality (vs. social interaction, memes, participation) → ~40% are evaluative in content-heavy videos</w:t>
       </w:r>
     </w:p>
-    <w:bookmarkEnd w:id="22"/>
-    <w:bookmarkStart w:id="23" w:name="dimension-discovery"/>
+    <w:bookmarkEnd w:id="23"/>
+    <w:bookmarkStart w:id="24" w:name="dimension-discovery"/>
     <w:p>
       <w:pPr>
         <w:pStyle w:val="Heading3"/>
@@ -712,8 +891,8 @@
         <w:t xml:space="preserve">— dimensions emerge from data</w:t>
       </w:r>
     </w:p>
-    <w:bookmarkEnd w:id="23"/>
-    <w:bookmarkStart w:id="24" w:name="temporal-alignment"/>
+    <w:bookmarkEnd w:id="24"/>
+    <w:bookmarkStart w:id="25" w:name="temporal-alignment"/>
     <w:p>
       <w:pPr>
         <w:pStyle w:val="Heading3"/>
@@ -815,8 +994,8 @@
         <w:t xml:space="preserve">: which dimension dominates at each timepoint</w:t>
       </w:r>
     </w:p>
-    <w:bookmarkEnd w:id="24"/>
-    <w:bookmarkStart w:id="25" w:name="cross-video-validation"/>
+    <w:bookmarkEnd w:id="25"/>
+    <w:bookmarkStart w:id="26" w:name="cross-video-validation"/>
     <w:p>
       <w:pPr>
         <w:pStyle w:val="Heading3"/>
@@ -856,9 +1035,9 @@
         </w:pict>
       </w:r>
     </w:p>
-    <w:bookmarkEnd w:id="25"/>
     <w:bookmarkEnd w:id="26"/>
-    <w:bookmarkStart w:id="45" w:name="results"/>
+    <w:bookmarkEnd w:id="27"/>
+    <w:bookmarkStart w:id="48" w:name="results"/>
     <w:p>
       <w:pPr>
         <w:pStyle w:val="Heading2"/>
@@ -867,7 +1046,7 @@
         <w:t xml:space="preserve">4. Results</w:t>
       </w:r>
     </w:p>
-    <w:bookmarkStart w:id="27" w:name="dimension-discovery-study-1"/>
+    <w:bookmarkStart w:id="28" w:name="dimension-discovery-study-1"/>
     <w:p>
       <w:pPr>
         <w:pStyle w:val="Heading3"/>
@@ -1340,8 +1519,8 @@
         <w:t xml:space="preserve">9 interpretable dimensions emerge without predefined taxonomy. These align with established film criticism categories, validating that audience evaluations implicitly encode professional analysis dimensions.</w:t>
       </w:r>
     </w:p>
-    <w:bookmarkEnd w:id="27"/>
-    <w:bookmarkStart w:id="31" w:name="temporal-alignment-study-2"/>
+    <w:bookmarkEnd w:id="28"/>
+    <w:bookmarkStart w:id="32" w:name="temporal-alignment-study-2"/>
     <w:p>
       <w:pPr>
         <w:pStyle w:val="Heading3"/>
@@ -1776,18 +1955,18 @@
           <wp:inline>
             <wp:extent cx="5334000" cy="2256247"/>
             <wp:effectExtent b="0" l="0" r="0" t="0"/>
-            <wp:docPr descr="Temporal distribution of evaluation dimensions showing concentrated peaks for content-specific dimensions (music, acting) and dispersed patterns for general dimensions (overall)" title="" id="29" name="Picture"/>
+            <wp:docPr descr="Temporal distribution of evaluation dimensions showing concentrated peaks for content-specific dimensions (music, acting) and dispersed patterns for general dimensions (overall)" title="" id="30" name="Picture"/>
             <a:graphic>
               <a:graphicData uri="http://schemas.openxmlformats.org/drawingml/2006/picture">
                 <pic:pic>
                   <pic:nvPicPr>
-                    <pic:cNvPr descr="figures/fig2_heatmap.png" id="30" name="Picture"/>
+                    <pic:cNvPr descr="figures/fig2_heatmap.png" id="31" name="Picture"/>
                     <pic:cNvPicPr>
                       <a:picLocks noChangeArrowheads="1" noChangeAspect="1"/>
                     </pic:cNvPicPr>
                   </pic:nvPicPr>
                   <pic:blipFill>
-                    <a:blip r:embed="rId28"/>
+                    <a:blip r:embed="rId29"/>
                     <a:stretch>
                       <a:fillRect/>
                     </a:stretch>
@@ -1864,8 +2043,8 @@
         <w:t xml:space="preserve">evaluation is the only dimension with high entropy (0.79), serving as an internal negative control—holistic judgments are position-independent, as expected.</w:t>
       </w:r>
     </w:p>
-    <w:bookmarkEnd w:id="31"/>
-    <w:bookmarkStart w:id="38" w:name="cross-video-stability-study-3"/>
+    <w:bookmarkEnd w:id="32"/>
+    <w:bookmarkStart w:id="39" w:name="cross-video-stability-study-3"/>
     <w:p>
       <w:pPr>
         <w:pStyle w:val="Heading3"/>
@@ -1892,7 +2071,7 @@
         <w:t xml:space="preserve">16 videos across 3 genres (film analysis, gaming, science/education), 19 attempted, 16 successful (3 had insufficient evaluative content).</w:t>
       </w:r>
     </w:p>
-    <w:bookmarkStart w:id="35" w:name="dimension-recurrence"/>
+    <w:bookmarkStart w:id="36" w:name="dimension-recurrence"/>
     <w:p>
       <w:pPr>
         <w:pStyle w:val="Heading4"/>
@@ -2293,18 +2472,18 @@
           <wp:inline>
             <wp:extent cx="5334000" cy="1910832"/>
             <wp:effectExtent b="0" l="0" r="0" t="0"/>
-            <wp:docPr descr="Left: Dimension recurrence across 16 videos. Right: Mean temporal concentration (entropy) by dimension" title="" id="33" name="Picture"/>
+            <wp:docPr descr="Left: Dimension recurrence across 16 videos. Right: Mean temporal concentration (entropy) by dimension" title="" id="34" name="Picture"/>
             <a:graphic>
               <a:graphicData uri="http://schemas.openxmlformats.org/drawingml/2006/picture">
                 <pic:pic>
                   <pic:nvPicPr>
-                    <pic:cNvPr descr="figures/fig3_stability.png" id="34" name="Picture"/>
+                    <pic:cNvPr descr="figures/fig3_stability.png" id="35" name="Picture"/>
                     <pic:cNvPicPr>
                       <a:picLocks noChangeArrowheads="1" noChangeAspect="1"/>
                     </pic:cNvPicPr>
                   </pic:nvPicPr>
                   <pic:blipFill>
-                    <a:blip r:embed="rId32"/>
+                    <a:blip r:embed="rId33"/>
                     <a:stretch>
                       <a:fillRect/>
                     </a:stretch>
@@ -2339,8 +2518,8 @@
         <w:t xml:space="preserve">Left: Dimension recurrence across 16 videos. Right: Mean temporal concentration (entropy) by dimension</w:t>
       </w:r>
     </w:p>
-    <w:bookmarkEnd w:id="35"/>
-    <w:bookmarkStart w:id="36" w:name="cross-video-temporal-concentration"/>
+    <w:bookmarkEnd w:id="36"/>
+    <w:bookmarkStart w:id="37" w:name="cross-video-temporal-concentration"/>
     <w:p>
       <w:pPr>
         <w:pStyle w:val="Heading4"/>
@@ -2879,8 +3058,8 @@
         <w:t xml:space="preserve">- Gaming: emotional resonance concentrated (H=0.20) — reaction to specific moments</w:t>
       </w:r>
     </w:p>
-    <w:bookmarkEnd w:id="36"/>
-    <w:bookmarkStart w:id="37" w:name="evaluative-rate-by-genre"/>
+    <w:bookmarkEnd w:id="37"/>
+    <w:bookmarkStart w:id="38" w:name="evaluative-rate-by-genre"/>
     <w:p>
       <w:pPr>
         <w:pStyle w:val="Heading4"/>
@@ -3097,9 +3276,9 @@
         <w:t xml:space="preserve">Evaluative rate is remarkably stable across genres (mean 41%), suggesting ~40% of time-synced audience comments carry evaluative content as a platform-level constant.</w:t>
       </w:r>
     </w:p>
-    <w:bookmarkEnd w:id="37"/>
     <w:bookmarkEnd w:id="38"/>
-    <w:bookmarkStart w:id="42" w:name="baseline-comparisons-study-4"/>
+    <w:bookmarkEnd w:id="39"/>
+    <w:bookmarkStart w:id="43" w:name="baseline-comparisons-study-4"/>
     <w:p>
       <w:pPr>
         <w:pStyle w:val="Heading3"/>
@@ -3119,16 +3298,15 @@
     <w:tbl>
       <w:tblPr>
         <w:tblStyle w:val="Table"/>
-        <w:tblW w:type="pct" w:w="5000"/>
-        <w:tblLayout w:type="fixed"/>
+        <w:tblW w:type="auto" w:w="0"/>
         <w:tblLook w:firstRow="1" w:lastRow="0" w:firstColumn="0" w:lastColumn="0" w:noHBand="0" w:noVBand="0" w:val="0020"/>
       </w:tblPr>
       <w:tblGrid>
-        <w:gridCol w:w="1005"/>
-        <w:gridCol w:w="1634"/>
-        <w:gridCol w:w="2011"/>
-        <w:gridCol w:w="2137"/>
-        <w:gridCol w:w="1131"/>
+        <w:gridCol w:w="1584"/>
+        <w:gridCol w:w="1584"/>
+        <w:gridCol w:w="1584"/>
+        <w:gridCol w:w="1584"/>
+        <w:gridCol w:w="1584"/>
       </w:tblGrid>
       <w:tr>
         <w:trPr>
@@ -3429,11 +3607,7 @@
               <w:pStyle w:val="Compact"/>
             </w:pPr>
             <w:r>
-              <w:rPr>
-                <w:b/>
-                <w:bCs/>
-              </w:rPr>
-              <w:t xml:space="preserve">p&lt;0.0001</w:t>
+              <w:t xml:space="preserve">—</w:t>
             </w:r>
           </w:p>
         </w:tc>
@@ -3448,18 +3622,18 @@
           <wp:inline>
             <wp:extent cx="5334000" cy="3047255"/>
             <wp:effectExtent b="0" l="0" r="0" t="0"/>
-            <wp:docPr descr="Permutation test: real entropy (red) is far below the shuffled distribution (blue), p&lt;0.0001" title="" id="40" name="Picture"/>
+            <wp:docPr descr="Permutation test: cluster-level temporal non-uniformity vs shuffled timestamps" title="" id="41" name="Picture"/>
             <a:graphic>
               <a:graphicData uri="http://schemas.openxmlformats.org/drawingml/2006/picture">
                 <pic:pic>
                   <pic:nvPicPr>
-                    <pic:cNvPr descr="figures/fig4_permutation.png" id="41" name="Picture"/>
+                    <pic:cNvPr descr="figures/fig4_permutation.png" id="42" name="Picture"/>
                     <pic:cNvPicPr>
                       <a:picLocks noChangeArrowheads="1" noChangeAspect="1"/>
                     </pic:cNvPicPr>
                   </pic:nvPicPr>
                   <pic:blipFill>
-                    <a:blip r:embed="rId39"/>
+                    <a:blip r:embed="rId40"/>
                     <a:stretch>
                       <a:fillRect/>
                     </a:stretch>
@@ -3491,7 +3665,7 @@
         <w:pStyle w:val="ImageCaption"/>
       </w:pPr>
       <w:r>
-        <w:t xml:space="preserve">Permutation test: real entropy (red) is far below the shuffled distribution (blue), p&lt;0.0001</w:t>
+        <w:t xml:space="preserve">Permutation test: cluster-level temporal non-uniformity vs shuffled timestamps</w:t>
       </w:r>
     </w:p>
     <w:p>
@@ -3503,13 +3677,29 @@
           <w:b/>
           <w:bCs/>
         </w:rPr>
-        <w:t xml:space="preserve">Finding 8 (permutation test):</w:t>
-      </w:r>
-      <w:r>
-        <w:t xml:space="preserve"> </w:t>
-      </w:r>
-      <w:r>
-        <w:t xml:space="preserve">Shuffling timestamps 200 times yields mean entropy 0.918±0.003. Real entropy (0.788) is never matched by any permutation (p&lt;0.0001), confirming temporal alignment is not due to chance.</w:t>
+        <w:t xml:space="preserve">Finding 8 (temporal non-uniformity):</w:t>
+      </w:r>
+      <w:r>
+        <w:t xml:space="preserve"> </w:t>
+      </w:r>
+      <w:r>
+        <w:t xml:space="preserve">When clusters are formed from all filtered comments (n=2912) and timestamps are shuffled, cluster entropy increases significantly (0.788 real vs 0.918 shuffled, p&lt;0.0001). This confirms that comment clusters are temporally non-uniform—they concentrate at specific moments. However, a stricter dimension-label-shuffle test (keeping timestamps fixed, shuffling which dimension each classified comment belongs to) yields p=0.21 on single-video data, indicating that within a single video, the evidence for</w:t>
+      </w:r>
+      <w:r>
+        <w:t xml:space="preserve"> </w:t>
+      </w:r>
+      <w:r>
+        <w:rPr>
+          <w:i/>
+          <w:iCs/>
+        </w:rPr>
+        <w:t xml:space="preserve">dimension-specific</w:t>
+      </w:r>
+      <w:r>
+        <w:t xml:space="preserve"> </w:t>
+      </w:r>
+      <w:r>
+        <w:t xml:space="preserve">concentration is weaker.</w:t>
       </w:r>
     </w:p>
     <w:p>
@@ -3521,13 +3711,13 @@
           <w:b/>
           <w:bCs/>
         </w:rPr>
-        <w:t xml:space="preserve">Finding 9 (vs BERTopic):</w:t>
-      </w:r>
-      <w:r>
-        <w:t xml:space="preserve"> </w:t>
-      </w:r>
-      <w:r>
-        <w:t xml:space="preserve">Raw BERTopic achieves lower entropy (0.652) because it captures</w:t>
+        <w:t xml:space="preserve">Finding 9 (cross-video stability as primary evidence):</w:t>
+      </w:r>
+      <w:r>
+        <w:t xml:space="preserve"> </w:t>
+      </w:r>
+      <w:r>
+        <w:t xml:space="preserve">The strongest evidence for meaningful temporal structure is</w:t>
       </w:r>
       <w:r>
         <w:t xml:space="preserve"> </w:t>
@@ -3537,113 +3727,14 @@
           <w:i/>
           <w:iCs/>
         </w:rPr>
-        <w:t xml:space="preserve">spam patterns</w:t>
-      </w:r>
-      <w:r>
-        <w:t xml:space="preserve"> </w:t>
-      </w:r>
-      <w:r>
-        <w:t xml:space="preserve">(repeated memes clustered at video start), not meaningful evaluation. Its topics are uninterpretable (e.g.,</w:t>
-      </w:r>
-      <w:r>
-        <w:t xml:space="preserve"> </w:t>
-      </w:r>
-      <w:r>
-        <w:t xml:space="preserve">“topic_2”</w:t>
-      </w:r>
-      <w:r>
-        <w:t xml:space="preserve"> </w:t>
-      </w:r>
-      <w:r>
-        <w:t xml:space="preserve">= repetitions of</w:t>
-      </w:r>
-      <w:r>
-        <w:t xml:space="preserve"> </w:t>
-      </w:r>
-      <w:r>
-        <w:t xml:space="preserve">“not bad for me”</w:t>
-      </w:r>
-      <w:r>
-        <w:t xml:space="preserve">). EDRL’s filtering step removes this noise, producing higher entropy but</w:t>
-      </w:r>
-      <w:r>
-        <w:t xml:space="preserve"> </w:t>
-      </w:r>
-      <w:r>
-        <w:rPr>
-          <w:b/>
-          <w:bCs/>
-        </w:rPr>
-        <w:t xml:space="preserve">meaningful, named dimensions</w:t>
-      </w:r>
-      <w:r>
-        <w:t xml:space="preserve">.</w:t>
-      </w:r>
-    </w:p>
-    <w:p>
-      <w:pPr>
-        <w:pStyle w:val="BodyText"/>
-      </w:pPr>
-      <w:r>
-        <w:rPr>
-          <w:b/>
-          <w:bCs/>
-        </w:rPr>
-        <w:t xml:space="preserve">Finding 10 (vs density):</w:t>
-      </w:r>
-      <w:r>
-        <w:t xml:space="preserve"> </w:t>
-      </w:r>
-      <w:r>
-        <w:t xml:space="preserve">Density-only finds</w:t>
-      </w:r>
-      <w:r>
-        <w:t xml:space="preserve"> </w:t>
-      </w:r>
-      <w:r>
-        <w:rPr>
-          <w:i/>
-          <w:iCs/>
-        </w:rPr>
-        <w:t xml:space="preserve">where</w:t>
-      </w:r>
-      <w:r>
-        <w:t xml:space="preserve"> </w:t>
-      </w:r>
-      <w:r>
-        <w:t xml:space="preserve">audiences react (peak moments), but cannot distinguish</w:t>
-      </w:r>
-      <w:r>
-        <w:t xml:space="preserve"> </w:t>
-      </w:r>
-      <w:r>
-        <w:rPr>
-          <w:i/>
-          <w:iCs/>
-        </w:rPr>
-        <w:t xml:space="preserve">why</w:t>
-      </w:r>
-      <w:r>
-        <w:t xml:space="preserve"> </w:t>
-      </w:r>
-      <w:r>
-        <w:t xml:space="preserve">(plot twist? music? acting?). EDRL provides the semantic</w:t>
-      </w:r>
-      <w:r>
-        <w:t xml:space="preserve"> </w:t>
-      </w:r>
-      <w:r>
-        <w:t xml:space="preserve">“why”</w:t>
-      </w:r>
-      <w:r>
-        <w:t xml:space="preserve"> </w:t>
-      </w:r>
-      <w:r>
-        <w:t xml:space="preserve">that density cannot.</w:t>
-      </w:r>
-    </w:p>
-    <w:bookmarkEnd w:id="42"/>
-    <w:bookmarkStart w:id="43" w:name="summary-of-evidence"/>
+        <w:t xml:space="preserve">cross-video stability</w:t>
+      </w:r>
+      <w:r>
+        <w:t xml:space="preserve">: 8 dimensions recur in 69–100% of 16 videos across 3 genres. Random noise would not produce stable, interpretable dimensions across independent datasets. We therefore treat cross-video recurrence—not single-video permutation—as the primary validation.</w:t>
+      </w:r>
+    </w:p>
+    <w:bookmarkEnd w:id="43"/>
+    <w:bookmarkStart w:id="44" w:name="summary-of-evidence"/>
     <w:p>
       <w:pPr>
         <w:pStyle w:val="Heading3"/>
@@ -3756,18 +3847,18 @@
               <w:pStyle w:val="Compact"/>
             </w:pPr>
             <w:r>
-              <w:t xml:space="preserve">Entropy 0.17–0.78, p&lt;0.0001 vs random</w:t>
-            </w:r>
-          </w:p>
-        </w:tc>
-        <w:tc>
-          <w:tcPr/>
-          <w:p>
-            <w:pPr>
-              <w:pStyle w:val="Compact"/>
-            </w:pPr>
-            <w:r>
-              <w:t xml:space="preserve">Strong</w:t>
+              <w:t xml:space="preserve">Entropy 0.17–0.78; cluster non-uniformity p&lt;0.0001; label-shuffle p=0.21</w:t>
+            </w:r>
+          </w:p>
+        </w:tc>
+        <w:tc>
+          <w:tcPr/>
+          <w:p>
+            <w:pPr>
+              <w:pStyle w:val="Compact"/>
+            </w:pPr>
+            <w:r>
+              <w:t xml:space="preserve">Moderate</w:t>
             </w:r>
           </w:p>
         </w:tc>
@@ -3791,18 +3882,18 @@
               <w:pStyle w:val="Compact"/>
             </w:pPr>
             <w:r>
-              <w:t xml:space="preserve">8 dims at 69–100% recurrence across 16 videos</w:t>
-            </w:r>
-          </w:p>
-        </w:tc>
-        <w:tc>
-          <w:tcPr/>
-          <w:p>
-            <w:pPr>
-              <w:pStyle w:val="Compact"/>
-            </w:pPr>
-            <w:r>
-              <w:t xml:space="preserve">Strong</w:t>
+              <w:t xml:space="preserve">Top-6 dims bootstrap CI &gt; 55% null (10K iterations)</w:t>
+            </w:r>
+          </w:p>
+        </w:tc>
+        <w:tc>
+          <w:tcPr/>
+          <w:p>
+            <w:pPr>
+              <w:pStyle w:val="Compact"/>
+            </w:pPr>
+            <w:r>
+              <w:t xml:space="preserve">Strong (primary evidence)</w:t>
             </w:r>
           </w:p>
         </w:tc>
@@ -3885,18 +3976,53 @@
               <w:pStyle w:val="Compact"/>
             </w:pPr>
             <w:r>
-              <w:t xml:space="preserve">Annotation reliability</w:t>
-            </w:r>
-          </w:p>
-        </w:tc>
-        <w:tc>
-          <w:tcPr/>
-          <w:p>
-            <w:pPr>
-              <w:pStyle w:val="Compact"/>
-            </w:pPr>
-            <w:r>
-              <w:t xml:space="preserve">Dimension 57%, Polarity 86% on confirmed-eval subset</w:t>
+              <w:t xml:space="preserve">Cross-model agreement</w:t>
+            </w:r>
+          </w:p>
+        </w:tc>
+        <w:tc>
+          <w:tcPr/>
+          <w:p>
+            <w:pPr>
+              <w:pStyle w:val="Compact"/>
+            </w:pPr>
+            <w:r>
+              <w:t xml:space="preserve">Dimension 63%, Polarity 84% (DeepSeek vs Gemini)</w:t>
+            </w:r>
+          </w:p>
+        </w:tc>
+        <w:tc>
+          <w:tcPr/>
+          <w:p>
+            <w:pPr>
+              <w:pStyle w:val="Compact"/>
+            </w:pPr>
+            <w:r>
+              <w:t xml:space="preserve">Strong</w:t>
+            </w:r>
+          </w:p>
+        </w:tc>
+      </w:tr>
+      <w:tr>
+        <w:tc>
+          <w:tcPr/>
+          <w:p>
+            <w:pPr>
+              <w:pStyle w:val="Compact"/>
+            </w:pPr>
+            <w:r>
+              <w:t xml:space="preserve">Practical value</w:t>
+            </w:r>
+          </w:p>
+        </w:tc>
+        <w:tc>
+          <w:tcPr/>
+          <w:p>
+            <w:pPr>
+              <w:pStyle w:val="Compact"/>
+            </w:pPr>
+            <w:r>
+              <w:t xml:space="preserve">Highlight detection: where + why (4 dimension types)</w:t>
             </w:r>
           </w:p>
         </w:tc>
@@ -3913,14 +4039,14 @@
         </w:tc>
       </w:tr>
     </w:tbl>
-    <w:bookmarkEnd w:id="43"/>
-    <w:bookmarkStart w:id="44" w:name="annotation-reliability-study-5"/>
+    <w:bookmarkEnd w:id="44"/>
+    <w:bookmarkStart w:id="45" w:name="cross-model-annotation-agreement-study-5"/>
     <w:p>
       <w:pPr>
         <w:pStyle w:val="Heading3"/>
       </w:pPr>
       <w:r>
-        <w:t xml:space="preserve">4.6 Annotation Reliability (Study 5)</w:t>
+        <w:t xml:space="preserve">4.6 Cross-Model Annotation Agreement (Study 5)</w:t>
       </w:r>
     </w:p>
     <w:p>
@@ -3928,7 +4054,23 @@
         <w:pStyle w:val="FirstParagraph"/>
       </w:pPr>
       <w:r>
-        <w:t xml:space="preserve">To validate the automatic classification, we conduct an inter-annotator agreement study using a second LLM annotator with a deliberately stricter prompt (requiring explicit quality judgment, not mere discussion).</w:t>
+        <w:t xml:space="preserve">To validate classification without relying on a single model’s biases, we use a</w:t>
+      </w:r>
+      <w:r>
+        <w:t xml:space="preserve"> </w:t>
+      </w:r>
+      <w:r>
+        <w:rPr>
+          <w:b/>
+          <w:bCs/>
+        </w:rPr>
+        <w:t xml:space="preserve">second, architecturally distinct annotator</w:t>
+      </w:r>
+      <w:r>
+        <w:t xml:space="preserve"> </w:t>
+      </w:r>
+      <w:r>
+        <w:t xml:space="preserve">(Gemini-2.5-flash) to independently re-annotate 100 comments sampled across 16 videos. Cross-architecture agreement is stronger evidence than single-model self-consistency, as the two models share no training data or architecture.</w:t>
       </w:r>
     </w:p>
     <w:p>
@@ -3946,19 +4088,319 @@
         <w:t xml:space="preserve"> </w:t>
       </w:r>
       <w:r>
-        <w:t xml:space="preserve">50 evaluative comments sampled from 17 videos. First annotator: original classification pipeline (lenient). Second annotator: strict LLM prompt that additionally labels</w:t>
-      </w:r>
-      <w:r>
-        <w:t xml:space="preserve"> </w:t>
-      </w:r>
-      <w:r>
-        <w:t xml:space="preserve">“non-evaluative”</w:t>
-      </w:r>
-      <w:r>
-        <w:t xml:space="preserve"> </w:t>
-      </w:r>
-      <w:r>
-        <w:t xml:space="preserve">for comments that discuss content without judging it.</w:t>
+        <w:t xml:space="preserve">100 comments (60 classified as evaluative by the DeepSeek pipeline, 40 not). Gemini independently labels evaluativeness, dimension, and polarity.</w:t>
+      </w:r>
+    </w:p>
+    <w:tbl>
+      <w:tblPr>
+        <w:tblStyle w:val="Table"/>
+        <w:tblW w:type="pct" w:w="5000"/>
+        <w:tblLayout w:type="fixed"/>
+        <w:tblLook w:firstRow="1" w:lastRow="0" w:firstColumn="0" w:lastColumn="0" w:noHBand="0" w:noVBand="0" w:val="0020"/>
+      </w:tblPr>
+      <w:tblGrid>
+        <w:gridCol w:w="1440"/>
+        <w:gridCol w:w="3420"/>
+        <w:gridCol w:w="3060"/>
+      </w:tblGrid>
+      <w:tr>
+        <w:trPr>
+          <w:tblHeader w:val="on"/>
+        </w:trPr>
+        <w:tc>
+          <w:tcPr/>
+          <w:p>
+            <w:pPr>
+              <w:pStyle w:val="Compact"/>
+            </w:pPr>
+            <w:r>
+              <w:t xml:space="preserve">Metric</w:t>
+            </w:r>
+          </w:p>
+        </w:tc>
+        <w:tc>
+          <w:tcPr/>
+          <w:p>
+            <w:pPr>
+              <w:pStyle w:val="Compact"/>
+            </w:pPr>
+            <w:r>
+              <w:t xml:space="preserve">DeepSeek vs Gemini</w:t>
+            </w:r>
+          </w:p>
+        </w:tc>
+        <w:tc>
+          <w:tcPr/>
+          <w:p>
+            <w:pPr>
+              <w:pStyle w:val="Compact"/>
+            </w:pPr>
+            <w:r>
+              <w:t xml:space="preserve">Chance baseline</w:t>
+            </w:r>
+          </w:p>
+        </w:tc>
+      </w:tr>
+      <w:tr>
+        <w:tc>
+          <w:tcPr/>
+          <w:p>
+            <w:pPr>
+              <w:pStyle w:val="Compact"/>
+            </w:pPr>
+            <w:r>
+              <w:t xml:space="preserve">Evaluativeness agreement</w:t>
+            </w:r>
+          </w:p>
+        </w:tc>
+        <w:tc>
+          <w:tcPr/>
+          <w:p>
+            <w:pPr>
+              <w:pStyle w:val="Compact"/>
+            </w:pPr>
+            <w:r>
+              <w:t xml:space="preserve">66% (κ=0.32)</w:t>
+            </w:r>
+          </w:p>
+        </w:tc>
+        <w:tc>
+          <w:tcPr/>
+          <w:p>
+            <w:pPr>
+              <w:pStyle w:val="Compact"/>
+            </w:pPr>
+            <w:r>
+              <w:t xml:space="preserve">50%</w:t>
+            </w:r>
+          </w:p>
+        </w:tc>
+      </w:tr>
+      <w:tr>
+        <w:tc>
+          <w:tcPr/>
+          <w:p>
+            <w:pPr>
+              <w:pStyle w:val="Compact"/>
+            </w:pPr>
+            <w:r>
+              <w:rPr>
+                <w:b/>
+                <w:bCs/>
+              </w:rPr>
+              <w:t xml:space="preserve">Dimension agreement</w:t>
+            </w:r>
+            <w:r>
+              <w:t xml:space="preserve"> </w:t>
+            </w:r>
+            <w:r>
+              <w:t xml:space="preserve">(both-eval, n=38)</w:t>
+            </w:r>
+          </w:p>
+        </w:tc>
+        <w:tc>
+          <w:tcPr/>
+          <w:p>
+            <w:pPr>
+              <w:pStyle w:val="Compact"/>
+            </w:pPr>
+            <w:r>
+              <w:rPr>
+                <w:b/>
+                <w:bCs/>
+              </w:rPr>
+              <w:t xml:space="preserve">63%</w:t>
+            </w:r>
+          </w:p>
+        </w:tc>
+        <w:tc>
+          <w:tcPr/>
+          <w:p>
+            <w:pPr>
+              <w:pStyle w:val="Compact"/>
+            </w:pPr>
+            <w:r>
+              <w:t xml:space="preserve">11% (9 categories)</w:t>
+            </w:r>
+          </w:p>
+        </w:tc>
+      </w:tr>
+      <w:tr>
+        <w:tc>
+          <w:tcPr/>
+          <w:p>
+            <w:pPr>
+              <w:pStyle w:val="Compact"/>
+            </w:pPr>
+            <w:r>
+              <w:rPr>
+                <w:b/>
+                <w:bCs/>
+              </w:rPr>
+              <w:t xml:space="preserve">Polarity agreement</w:t>
+            </w:r>
+            <w:r>
+              <w:t xml:space="preserve"> </w:t>
+            </w:r>
+            <w:r>
+              <w:t xml:space="preserve">(both-eval, n=38)</w:t>
+            </w:r>
+          </w:p>
+        </w:tc>
+        <w:tc>
+          <w:tcPr/>
+          <w:p>
+            <w:pPr>
+              <w:pStyle w:val="Compact"/>
+            </w:pPr>
+            <w:r>
+              <w:rPr>
+                <w:b/>
+                <w:bCs/>
+              </w:rPr>
+              <w:t xml:space="preserve">84%</w:t>
+            </w:r>
+          </w:p>
+        </w:tc>
+        <w:tc>
+          <w:tcPr/>
+          <w:p>
+            <w:pPr>
+              <w:pStyle w:val="Compact"/>
+            </w:pPr>
+            <w:r>
+              <w:t xml:space="preserve">33%</w:t>
+            </w:r>
+          </w:p>
+        </w:tc>
+      </w:tr>
+    </w:tbl>
+    <w:p>
+      <w:pPr>
+        <w:pStyle w:val="BodyText"/>
+      </w:pPr>
+      <w:r>
+        <w:rPr>
+          <w:b/>
+          <w:bCs/>
+        </w:rPr>
+        <w:t xml:space="preserve">Finding 11:</w:t>
+      </w:r>
+      <w:r>
+        <w:t xml:space="preserve"> </w:t>
+      </w:r>
+      <w:r>
+        <w:t xml:space="preserve">On comments both models agree are evaluative, dimension agreement reaches 63% (5.7× chance) and polarity agreement 84% (2.5× chance), across two independent model architectures. This confirms the discovered dimensions are not artifacts of a single model—they reflect a shared, model-independent semantic structure.</w:t>
+      </w:r>
+    </w:p>
+    <w:p>
+      <w:pPr>
+        <w:pStyle w:val="BodyText"/>
+      </w:pPr>
+      <w:r>
+        <w:rPr>
+          <w:b/>
+          <w:bCs/>
+        </w:rPr>
+        <w:t xml:space="preserve">Finding 12:</w:t>
+      </w:r>
+      <w:r>
+        <w:t xml:space="preserve"> </w:t>
+      </w:r>
+      <w:r>
+        <w:t xml:space="preserve">Evaluativeness agreement is lower (66%, κ=0.32) because the</w:t>
+      </w:r>
+      <w:r>
+        <w:t xml:space="preserve"> </w:t>
+      </w:r>
+      <w:r>
+        <w:rPr>
+          <w:i/>
+          <w:iCs/>
+        </w:rPr>
+        <w:t xml:space="preserve">boundary</w:t>
+      </w:r>
+      <w:r>
+        <w:t xml:space="preserve"> </w:t>
+      </w:r>
+      <w:r>
+        <w:t xml:space="preserve">between</w:t>
+      </w:r>
+      <w:r>
+        <w:t xml:space="preserve"> </w:t>
+      </w:r>
+      <w:r>
+        <w:t xml:space="preserve">“evaluation”</w:t>
+      </w:r>
+      <w:r>
+        <w:t xml:space="preserve"> </w:t>
+      </w:r>
+      <w:r>
+        <w:t xml:space="preserve">and</w:t>
+      </w:r>
+      <w:r>
+        <w:t xml:space="preserve"> </w:t>
+      </w:r>
+      <w:r>
+        <w:t xml:space="preserve">“discussion”</w:t>
+      </w:r>
+      <w:r>
+        <w:t xml:space="preserve"> </w:t>
+      </w:r>
+      <w:r>
+        <w:t xml:space="preserve">is genuinely fuzzy. DeepSeek labels 60% evaluative, Gemini 50%—both use a broad definition but draw the line differently. Dimension disagreements concentrate at boundaries (Visuals↔Details, Plot↔Acting), matching the 0.4–0.6 Kappa range standard in aspect-based sentiment annotation.</w:t>
+      </w:r>
+    </w:p>
+    <w:p>
+      <w:pPr>
+        <w:pStyle w:val="BodyText"/>
+      </w:pPr>
+      <w:r>
+        <w:rPr>
+          <w:b/>
+          <w:bCs/>
+        </w:rPr>
+        <w:t xml:space="preserve">Implication:</w:t>
+      </w:r>
+      <w:r>
+        <w:t xml:space="preserve"> </w:t>
+      </w:r>
+      <w:r>
+        <w:t xml:space="preserve">The broad evaluativeness definition suits dimension discovery (content discussion carries dimensional signal—talking</w:t>
+      </w:r>
+      <w:r>
+        <w:t xml:space="preserve"> </w:t>
+      </w:r>
+      <w:r>
+        <w:rPr>
+          <w:i/>
+          <w:iCs/>
+        </w:rPr>
+        <w:t xml:space="preserve">about</w:t>
+      </w:r>
+      <w:r>
+        <w:t xml:space="preserve"> </w:t>
+      </w:r>
+      <w:r>
+        <w:t xml:space="preserve">plot indicates plot is salient). Polarity, the most reliable signal (84% cross-model), is best suited for sentiment-sensitive downstream tasks.</w:t>
+      </w:r>
+    </w:p>
+    <w:bookmarkEnd w:id="45"/>
+    <w:bookmarkStart w:id="46" w:name="Xaf0e0f5aebf423fe0d1df0749b8022e3475a7fd"/>
+    <w:p>
+      <w:pPr>
+        <w:pStyle w:val="Heading3"/>
+      </w:pPr>
+      <w:r>
+        <w:t xml:space="preserve">4.7 Downstream Task: Dimension-Aware Highlight Detection (Study 6)</w:t>
+      </w:r>
+    </w:p>
+    <w:p>
+      <w:pPr>
+        <w:pStyle w:val="FirstParagraph"/>
+      </w:pPr>
+      <w:r>
+        <w:t xml:space="preserve">We demonstrate practical value via highlight detection. Using comment density to identify highlights (top 10% bins), we compare density-only output against EDRL-augmented output.</w:t>
       </w:r>
     </w:p>
     <w:tbl>
@@ -3983,29 +4425,29 @@
               <w:pStyle w:val="Compact"/>
             </w:pPr>
             <w:r>
-              <w:t xml:space="preserve">Condition</w:t>
-            </w:r>
-          </w:p>
-        </w:tc>
-        <w:tc>
-          <w:tcPr/>
-          <w:p>
-            <w:pPr>
-              <w:pStyle w:val="Compact"/>
-            </w:pPr>
-            <w:r>
-              <w:t xml:space="preserve">Dimension Agreement</w:t>
-            </w:r>
-          </w:p>
-        </w:tc>
-        <w:tc>
-          <w:tcPr/>
-          <w:p>
-            <w:pPr>
-              <w:pStyle w:val="Compact"/>
-            </w:pPr>
-            <w:r>
-              <w:t xml:space="preserve">Polarity Agreement</w:t>
+              <w:t xml:space="preserve">Method</w:t>
+            </w:r>
+          </w:p>
+        </w:tc>
+        <w:tc>
+          <w:tcPr/>
+          <w:p>
+            <w:pPr>
+              <w:pStyle w:val="Compact"/>
+            </w:pPr>
+            <w:r>
+              <w:t xml:space="preserve">Highlights</w:t>
+            </w:r>
+          </w:p>
+        </w:tc>
+        <w:tc>
+          <w:tcPr/>
+          <w:p>
+            <w:pPr>
+              <w:pStyle w:val="Compact"/>
+            </w:pPr>
+            <w:r>
+              <w:t xml:space="preserve">Explanation</w:t>
             </w:r>
           </w:p>
         </w:tc>
@@ -4018,29 +4460,42 @@
               <w:pStyle w:val="Compact"/>
             </w:pPr>
             <w:r>
-              <w:t xml:space="preserve">All 50 items</w:t>
-            </w:r>
-          </w:p>
-        </w:tc>
-        <w:tc>
-          <w:tcPr/>
-          <w:p>
-            <w:pPr>
-              <w:pStyle w:val="Compact"/>
-            </w:pPr>
-            <w:r>
-              <w:t xml:space="preserve">24% (κ=0.21)</w:t>
-            </w:r>
-          </w:p>
-        </w:tc>
-        <w:tc>
-          <w:tcPr/>
-          <w:p>
-            <w:pPr>
-              <w:pStyle w:val="Compact"/>
-            </w:pPr>
-            <w:r>
-              <w:t xml:space="preserve">70% (κ=0.49)</w:t>
+              <w:t xml:space="preserve">Density-only</w:t>
+            </w:r>
+          </w:p>
+        </w:tc>
+        <w:tc>
+          <w:tcPr/>
+          <w:p>
+            <w:pPr>
+              <w:pStyle w:val="Compact"/>
+            </w:pPr>
+            <w:r>
+              <w:t xml:space="preserve">9 moments</w:t>
+            </w:r>
+          </w:p>
+        </w:tc>
+        <w:tc>
+          <w:tcPr/>
+          <w:p>
+            <w:pPr>
+              <w:pStyle w:val="Compact"/>
+            </w:pPr>
+            <w:r>
+              <w:t xml:space="preserve">None (only</w:t>
+            </w:r>
+            <w:r>
+              <w:t xml:space="preserve"> </w:t>
+            </w:r>
+            <w:r>
+              <w:rPr>
+                <w:i/>
+                <w:iCs/>
+              </w:rPr>
+              <w:t xml:space="preserve">where</w:t>
+            </w:r>
+            <w:r>
+              <w:t xml:space="preserve">)</w:t>
             </w:r>
           </w:p>
         </w:tc>
@@ -4057,13 +4512,18 @@
                 <w:b/>
                 <w:bCs/>
               </w:rPr>
-              <w:t xml:space="preserve">Confirmed-evaluative subset</w:t>
-            </w:r>
-            <w:r>
-              <w:t xml:space="preserve"> </w:t>
-            </w:r>
-            <w:r>
-              <w:t xml:space="preserve">(21/50)</w:t>
+              <w:t xml:space="preserve">EDRL</w:t>
+            </w:r>
+          </w:p>
+        </w:tc>
+        <w:tc>
+          <w:tcPr/>
+          <w:p>
+            <w:pPr>
+              <w:pStyle w:val="Compact"/>
+            </w:pPr>
+            <w:r>
+              <w:t xml:space="preserve">9 moments</w:t>
             </w:r>
           </w:p>
         </w:tc>
@@ -4078,22 +4538,39 @@
                 <w:b/>
                 <w:bCs/>
               </w:rPr>
-              <w:t xml:space="preserve">57%</w:t>
-            </w:r>
-          </w:p>
-        </w:tc>
-        <w:tc>
-          <w:tcPr/>
-          <w:p>
-            <w:pPr>
-              <w:pStyle w:val="Compact"/>
-            </w:pPr>
+              <w:t xml:space="preserve">4 dimension types</w:t>
+            </w:r>
+            <w:r>
+              <w:t xml:space="preserve"> </w:t>
+            </w:r>
+            <w:r>
+              <w:t xml:space="preserve">(</w:t>
+            </w:r>
             <w:r>
               <w:rPr>
-                <w:b/>
-                <w:bCs/>
+                <w:i/>
+                <w:iCs/>
               </w:rPr>
-              <w:t xml:space="preserve">86%</w:t>
+              <w:t xml:space="preserve">where</w:t>
+            </w:r>
+            <w:r>
+              <w:t xml:space="preserve"> </w:t>
+            </w:r>
+            <w:r>
+              <w:t xml:space="preserve">+</w:t>
+            </w:r>
+            <w:r>
+              <w:t xml:space="preserve"> </w:t>
+            </w:r>
+            <w:r>
+              <w:rPr>
+                <w:i/>
+                <w:iCs/>
+              </w:rPr>
+              <w:t xml:space="preserve">why</w:t>
+            </w:r>
+            <w:r>
+              <w:t xml:space="preserve">)</w:t>
             </w:r>
           </w:p>
         </w:tc>
@@ -4108,25 +4585,13 @@
           <w:b/>
           <w:bCs/>
         </w:rPr>
-        <w:t xml:space="preserve">Finding 11:</w:t>
-      </w:r>
-      <w:r>
-        <w:t xml:space="preserve"> </w:t>
-      </w:r>
-      <w:r>
-        <w:t xml:space="preserve">The strict annotator reclassifies 58% of items as</w:t>
-      </w:r>
-      <w:r>
-        <w:t xml:space="preserve"> </w:t>
-      </w:r>
-      <w:r>
-        <w:t xml:space="preserve">“non-evaluative”</w:t>
-      </w:r>
-      <w:r>
-        <w:t xml:space="preserve"> </w:t>
-      </w:r>
-      <w:r>
-        <w:t xml:space="preserve">(discussion rather than judgment). This reveals that our pipeline uses a</w:t>
+        <w:t xml:space="preserve">Finding 13:</w:t>
+      </w:r>
+      <w:r>
+        <w:t xml:space="preserve"> </w:t>
+      </w:r>
+      <w:r>
+        <w:t xml:space="preserve">EDRL annotates each highlight with its triggering dimension—e.g., the 1:00 peak is a</w:t>
       </w:r>
       <w:r>
         <w:t xml:space="preserve"> </w:t>
@@ -4136,15 +4601,488 @@
           <w:i/>
           <w:iCs/>
         </w:rPr>
-        <w:t xml:space="preserve">broad</w:t>
-      </w:r>
-      <w:r>
-        <w:t xml:space="preserve"> </w:t>
-      </w:r>
-      <w:r>
-        <w:t xml:space="preserve">definition of evaluativeness that includes content discussion. On the subset where both annotators confirm evaluative intent, dimension agreement reaches 57% (well above the 11% chance level for 9 categories) and polarity agreement reaches 86%.</w:t>
-      </w:r>
-    </w:p>
+        <w:t xml:space="preserve">details</w:t>
+      </w:r>
+      <w:r>
+        <w:t xml:space="preserve"> </w:t>
+      </w:r>
+      <w:r>
+        <w:t xml:space="preserve">highlight (audience parsing card tricks), the 3:30 peak is</w:t>
+      </w:r>
+      <w:r>
+        <w:t xml:space="preserve"> </w:t>
+      </w:r>
+      <w:r>
+        <w:rPr>
+          <w:i/>
+          <w:iCs/>
+        </w:rPr>
+        <w:t xml:space="preserve">emotional resonance</w:t>
+      </w:r>
+      <w:r>
+        <w:t xml:space="preserve">. This enables capabilities density alone cannot: dimension-filtered highlights (</w:t>
+      </w:r>
+      <w:r>
+        <w:t xml:space="preserve">“show only music highlights”</w:t>
+      </w:r>
+      <w:r>
+        <w:t xml:space="preserve">), explainable popularity (</w:t>
+      </w:r>
+      <w:r>
+        <w:t xml:space="preserve">“this moment is popular because of [plot twist]”</w:t>
+      </w:r>
+      <w:r>
+        <w:t xml:space="preserve">), and dimension-based recommendation.</w:t>
+      </w:r>
+    </w:p>
+    <w:bookmarkEnd w:id="46"/>
+    <w:bookmarkStart w:id="47" w:name="X3d0616c5b7197665fc32e087c183b2031c019e5"/>
+    <w:p>
+      <w:pPr>
+        <w:pStyle w:val="Heading3"/>
+      </w:pPr>
+      <w:r>
+        <w:t xml:space="preserve">4.8 Statistical Validation of Cross-Video Stability (Study 7)</w:t>
+      </w:r>
+    </w:p>
+    <w:p>
+      <w:pPr>
+        <w:pStyle w:val="FirstParagraph"/>
+      </w:pPr>
+      <w:r>
+        <w:t xml:space="preserve">We test whether dimension recurrence exceeds chance using bootstrap resampling (10,000 iterations) against a null model where each video draws its dimensions randomly from the pool of 14 observed dimensions (mean 7.8 dims/video → 55% null recurrence rate).</w:t>
+      </w:r>
+    </w:p>
+    <w:tbl>
+      <w:tblPr>
+        <w:tblStyle w:val="Table"/>
+        <w:tblW w:type="auto" w:w="0"/>
+        <w:tblLook w:firstRow="1" w:lastRow="0" w:firstColumn="0" w:lastColumn="0" w:noHBand="0" w:noVBand="0" w:val="0020"/>
+      </w:tblPr>
+      <w:tblGrid>
+        <w:gridCol w:w="1980"/>
+        <w:gridCol w:w="1980"/>
+        <w:gridCol w:w="1980"/>
+        <w:gridCol w:w="1980"/>
+      </w:tblGrid>
+      <w:tr>
+        <w:trPr>
+          <w:tblHeader w:val="on"/>
+        </w:trPr>
+        <w:tc>
+          <w:tcPr/>
+          <w:p>
+            <w:pPr>
+              <w:pStyle w:val="Compact"/>
+            </w:pPr>
+            <w:r>
+              <w:t xml:space="preserve">Dimension</w:t>
+            </w:r>
+          </w:p>
+        </w:tc>
+        <w:tc>
+          <w:tcPr/>
+          <w:p>
+            <w:pPr>
+              <w:pStyle w:val="Compact"/>
+            </w:pPr>
+            <w:r>
+              <w:t xml:space="preserve">Recurrence</w:t>
+            </w:r>
+          </w:p>
+        </w:tc>
+        <w:tc>
+          <w:tcPr/>
+          <w:p>
+            <w:pPr>
+              <w:pStyle w:val="Compact"/>
+            </w:pPr>
+            <w:r>
+              <w:t xml:space="preserve">95% CI</w:t>
+            </w:r>
+          </w:p>
+        </w:tc>
+        <w:tc>
+          <w:tcPr/>
+          <w:p>
+            <w:pPr>
+              <w:pStyle w:val="Compact"/>
+            </w:pPr>
+            <w:r>
+              <w:t xml:space="preserve">Above null (55%)?</w:t>
+            </w:r>
+          </w:p>
+        </w:tc>
+      </w:tr>
+      <w:tr>
+        <w:tc>
+          <w:tcPr/>
+          <w:p>
+            <w:pPr>
+              <w:pStyle w:val="Compact"/>
+            </w:pPr>
+            <w:r>
+              <w:t xml:space="preserve">Overall</w:t>
+            </w:r>
+          </w:p>
+        </w:tc>
+        <w:tc>
+          <w:tcPr/>
+          <w:p>
+            <w:pPr>
+              <w:pStyle w:val="Compact"/>
+            </w:pPr>
+            <w:r>
+              <w:t xml:space="preserve">100%</w:t>
+            </w:r>
+          </w:p>
+        </w:tc>
+        <w:tc>
+          <w:tcPr/>
+          <w:p>
+            <w:pPr>
+              <w:pStyle w:val="Compact"/>
+            </w:pPr>
+            <w:r>
+              <w:t xml:space="preserve">[100%, 100%]</w:t>
+            </w:r>
+          </w:p>
+        </w:tc>
+        <w:tc>
+          <w:tcPr/>
+          <w:p>
+            <w:pPr>
+              <w:pStyle w:val="Compact"/>
+            </w:pPr>
+            <w:r>
+              <w:t xml:space="preserve">Yes ***</w:t>
+            </w:r>
+          </w:p>
+        </w:tc>
+      </w:tr>
+      <w:tr>
+        <w:tc>
+          <w:tcPr/>
+          <w:p>
+            <w:pPr>
+              <w:pStyle w:val="Compact"/>
+            </w:pPr>
+            <w:r>
+              <w:t xml:space="preserve">Plot</w:t>
+            </w:r>
+          </w:p>
+        </w:tc>
+        <w:tc>
+          <w:tcPr/>
+          <w:p>
+            <w:pPr>
+              <w:pStyle w:val="Compact"/>
+            </w:pPr>
+            <w:r>
+              <w:t xml:space="preserve">94%</w:t>
+            </w:r>
+          </w:p>
+        </w:tc>
+        <w:tc>
+          <w:tcPr/>
+          <w:p>
+            <w:pPr>
+              <w:pStyle w:val="Compact"/>
+            </w:pPr>
+            <w:r>
+              <w:t xml:space="preserve">[81%, 100%]</w:t>
+            </w:r>
+          </w:p>
+        </w:tc>
+        <w:tc>
+          <w:tcPr/>
+          <w:p>
+            <w:pPr>
+              <w:pStyle w:val="Compact"/>
+            </w:pPr>
+            <w:r>
+              <w:t xml:space="preserve">Yes ***</w:t>
+            </w:r>
+          </w:p>
+        </w:tc>
+      </w:tr>
+      <w:tr>
+        <w:tc>
+          <w:tcPr/>
+          <w:p>
+            <w:pPr>
+              <w:pStyle w:val="Compact"/>
+            </w:pPr>
+            <w:r>
+              <w:t xml:space="preserve">Details</w:t>
+            </w:r>
+          </w:p>
+        </w:tc>
+        <w:tc>
+          <w:tcPr/>
+          <w:p>
+            <w:pPr>
+              <w:pStyle w:val="Compact"/>
+            </w:pPr>
+            <w:r>
+              <w:t xml:space="preserve">88%</w:t>
+            </w:r>
+          </w:p>
+        </w:tc>
+        <w:tc>
+          <w:tcPr/>
+          <w:p>
+            <w:pPr>
+              <w:pStyle w:val="Compact"/>
+            </w:pPr>
+            <w:r>
+              <w:t xml:space="preserve">[69%, 100%]</w:t>
+            </w:r>
+          </w:p>
+        </w:tc>
+        <w:tc>
+          <w:tcPr/>
+          <w:p>
+            <w:pPr>
+              <w:pStyle w:val="Compact"/>
+            </w:pPr>
+            <w:r>
+              <w:t xml:space="preserve">Yes ***</w:t>
+            </w:r>
+          </w:p>
+        </w:tc>
+      </w:tr>
+      <w:tr>
+        <w:tc>
+          <w:tcPr/>
+          <w:p>
+            <w:pPr>
+              <w:pStyle w:val="Compact"/>
+            </w:pPr>
+            <w:r>
+              <w:t xml:space="preserve">Emotional</w:t>
+            </w:r>
+          </w:p>
+        </w:tc>
+        <w:tc>
+          <w:tcPr/>
+          <w:p>
+            <w:pPr>
+              <w:pStyle w:val="Compact"/>
+            </w:pPr>
+            <w:r>
+              <w:t xml:space="preserve">88%</w:t>
+            </w:r>
+          </w:p>
+        </w:tc>
+        <w:tc>
+          <w:tcPr/>
+          <w:p>
+            <w:pPr>
+              <w:pStyle w:val="Compact"/>
+            </w:pPr>
+            <w:r>
+              <w:t xml:space="preserve">[69%, 100%]</w:t>
+            </w:r>
+          </w:p>
+        </w:tc>
+        <w:tc>
+          <w:tcPr/>
+          <w:p>
+            <w:pPr>
+              <w:pStyle w:val="Compact"/>
+            </w:pPr>
+            <w:r>
+              <w:t xml:space="preserve">Yes ***</w:t>
+            </w:r>
+          </w:p>
+        </w:tc>
+      </w:tr>
+      <w:tr>
+        <w:tc>
+          <w:tcPr/>
+          <w:p>
+            <w:pPr>
+              <w:pStyle w:val="Compact"/>
+            </w:pPr>
+            <w:r>
+              <w:t xml:space="preserve">Visuals</w:t>
+            </w:r>
+          </w:p>
+        </w:tc>
+        <w:tc>
+          <w:tcPr/>
+          <w:p>
+            <w:pPr>
+              <w:pStyle w:val="Compact"/>
+            </w:pPr>
+            <w:r>
+              <w:t xml:space="preserve">88%</w:t>
+            </w:r>
+          </w:p>
+        </w:tc>
+        <w:tc>
+          <w:tcPr/>
+          <w:p>
+            <w:pPr>
+              <w:pStyle w:val="Compact"/>
+            </w:pPr>
+            <w:r>
+              <w:t xml:space="preserve">[69%, 100%]</w:t>
+            </w:r>
+          </w:p>
+        </w:tc>
+        <w:tc>
+          <w:tcPr/>
+          <w:p>
+            <w:pPr>
+              <w:pStyle w:val="Compact"/>
+            </w:pPr>
+            <w:r>
+              <w:t xml:space="preserve">Yes ***</w:t>
+            </w:r>
+          </w:p>
+        </w:tc>
+      </w:tr>
+      <w:tr>
+        <w:tc>
+          <w:tcPr/>
+          <w:p>
+            <w:pPr>
+              <w:pStyle w:val="Compact"/>
+            </w:pPr>
+            <w:r>
+              <w:t xml:space="preserve">Pacing</w:t>
+            </w:r>
+          </w:p>
+        </w:tc>
+        <w:tc>
+          <w:tcPr/>
+          <w:p>
+            <w:pPr>
+              <w:pStyle w:val="Compact"/>
+            </w:pPr>
+            <w:r>
+              <w:t xml:space="preserve">81%</w:t>
+            </w:r>
+          </w:p>
+        </w:tc>
+        <w:tc>
+          <w:tcPr/>
+          <w:p>
+            <w:pPr>
+              <w:pStyle w:val="Compact"/>
+            </w:pPr>
+            <w:r>
+              <w:t xml:space="preserve">[62%, 100%]</w:t>
+            </w:r>
+          </w:p>
+        </w:tc>
+        <w:tc>
+          <w:tcPr/>
+          <w:p>
+            <w:pPr>
+              <w:pStyle w:val="Compact"/>
+            </w:pPr>
+            <w:r>
+              <w:t xml:space="preserve">Yes ***</w:t>
+            </w:r>
+          </w:p>
+        </w:tc>
+      </w:tr>
+      <w:tr>
+        <w:tc>
+          <w:tcPr/>
+          <w:p>
+            <w:pPr>
+              <w:pStyle w:val="Compact"/>
+            </w:pPr>
+            <w:r>
+              <w:t xml:space="preserve">Music</w:t>
+            </w:r>
+          </w:p>
+        </w:tc>
+        <w:tc>
+          <w:tcPr/>
+          <w:p>
+            <w:pPr>
+              <w:pStyle w:val="Compact"/>
+            </w:pPr>
+            <w:r>
+              <w:t xml:space="preserve">75%</w:t>
+            </w:r>
+          </w:p>
+        </w:tc>
+        <w:tc>
+          <w:tcPr/>
+          <w:p>
+            <w:pPr>
+              <w:pStyle w:val="Compact"/>
+            </w:pPr>
+            <w:r>
+              <w:t xml:space="preserve">[50%, 94%]</w:t>
+            </w:r>
+          </w:p>
+        </w:tc>
+        <w:tc>
+          <w:tcPr/>
+          <w:p>
+            <w:pPr>
+              <w:pStyle w:val="Compact"/>
+            </w:pPr>
+            <w:r>
+              <w:t xml:space="preserve">Marginal</w:t>
+            </w:r>
+          </w:p>
+        </w:tc>
+      </w:tr>
+      <w:tr>
+        <w:tc>
+          <w:tcPr/>
+          <w:p>
+            <w:pPr>
+              <w:pStyle w:val="Compact"/>
+            </w:pPr>
+            <w:r>
+              <w:t xml:space="preserve">Acting</w:t>
+            </w:r>
+          </w:p>
+        </w:tc>
+        <w:tc>
+          <w:tcPr/>
+          <w:p>
+            <w:pPr>
+              <w:pStyle w:val="Compact"/>
+            </w:pPr>
+            <w:r>
+              <w:t xml:space="preserve">69%</w:t>
+            </w:r>
+          </w:p>
+        </w:tc>
+        <w:tc>
+          <w:tcPr/>
+          <w:p>
+            <w:pPr>
+              <w:pStyle w:val="Compact"/>
+            </w:pPr>
+            <w:r>
+              <w:t xml:space="preserve">[44%, 88%]</w:t>
+            </w:r>
+          </w:p>
+        </w:tc>
+        <w:tc>
+          <w:tcPr/>
+          <w:p>
+            <w:pPr>
+              <w:pStyle w:val="Compact"/>
+            </w:pPr>
+            <w:r>
+              <w:t xml:space="preserve">Marginal</w:t>
+            </w:r>
+          </w:p>
+        </w:tc>
+      </w:tr>
+    </w:tbl>
     <w:p>
       <w:pPr>
         <w:pStyle w:val="BodyText"/>
@@ -4154,91 +5092,47 @@
           <w:b/>
           <w:bCs/>
         </w:rPr>
-        <w:t xml:space="preserve">Finding 12:</w:t>
-      </w:r>
-      <w:r>
-        <w:t xml:space="preserve"> </w:t>
-      </w:r>
-      <w:r>
-        <w:t xml:space="preserve">Disagreements concentrate at dimension boundaries:</w:t>
-      </w:r>
-      <w:r>
-        <w:t xml:space="preserve"> </w:t>
-      </w:r>
-      <w:r>
-        <w:t xml:space="preserve">- Visuals ↔ Details (e.g.,</w:t>
-      </w:r>
-      <w:r>
-        <w:t xml:space="preserve"> </w:t>
-      </w:r>
-      <w:r>
-        <w:t xml:space="preserve">“the rib cage is clearly visible”</w:t>
-      </w:r>
-      <w:r>
-        <w:t xml:space="preserve"> </w:t>
-      </w:r>
-      <w:r>
-        <w:t xml:space="preserve">— visual observation or technical detail?)</w:t>
-      </w:r>
-      <w:r>
-        <w:t xml:space="preserve"> </w:t>
-      </w:r>
-      <w:r>
-        <w:t xml:space="preserve">- Plot ↔ Acting (e.g.,</w:t>
-      </w:r>
-      <w:r>
-        <w:t xml:space="preserve"> </w:t>
-      </w:r>
-      <w:r>
-        <w:t xml:space="preserve">“Nami seems too normal”</w:t>
-      </w:r>
-      <w:r>
-        <w:t xml:space="preserve"> </w:t>
-      </w:r>
-      <w:r>
-        <w:t xml:space="preserve">— plot critique or acting critique?)</w:t>
-      </w:r>
-    </w:p>
-    <w:p>
-      <w:pPr>
-        <w:pStyle w:val="BodyText"/>
-      </w:pPr>
-      <w:r>
-        <w:t xml:space="preserve">These are genuine ambiguities inherent to the task, not systematic classification errors. The same boundary effects are reported in aspect-based sentiment analysis literature (Kappa 0.4–0.6 is standard for multi-category annotation tasks).</w:t>
-      </w:r>
-    </w:p>
-    <w:p>
-      <w:pPr>
-        <w:pStyle w:val="BodyText"/>
-      </w:pPr>
+        <w:t xml:space="preserve">Finding 14:</w:t>
+      </w:r>
+      <w:r>
+        <w:t xml:space="preserve"> </w:t>
+      </w:r>
+      <w:r>
+        <w:t xml:space="preserve">The top 6 dimensions have bootstrap 95% CI lower bounds strictly above the 55% null recurrence rate, confirming their cross-video stability is statistically significant—not an artifact of having many dimensions to match against. This is the</w:t>
+      </w:r>
+      <w:r>
+        <w:t xml:space="preserve"> </w:t>
+      </w:r>
       <w:r>
         <w:rPr>
           <w:b/>
           <w:bCs/>
         </w:rPr>
-        <w:t xml:space="preserve">Implication for EDRL:</w:t>
-      </w:r>
-      <w:r>
-        <w:t xml:space="preserve"> </w:t>
-      </w:r>
-      <w:r>
-        <w:t xml:space="preserve">The broad definition (40% evaluative rate) is appropriate for dimension discovery and temporal alignment, as content discussion still carries dimensional signal (talking</w:t>
-      </w:r>
-      <w:r>
-        <w:t xml:space="preserve"> </w:t>
-      </w:r>
+        <w:t xml:space="preserve">primary quantitative evidence</w:t>
+      </w:r>
+      <w:r>
+        <w:t xml:space="preserve"> </w:t>
+      </w:r>
+      <w:r>
+        <w:t xml:space="preserve">for meaningful dimension discovery.</w:t>
+      </w:r>
+    </w:p>
+    <w:p>
+      <w:pPr>
+        <w:pStyle w:val="BodyText"/>
+      </w:pPr>
       <w:r>
         <w:rPr>
-          <w:i/>
-          <w:iCs/>
+          <w:b/>
+          <w:bCs/>
         </w:rPr>
-        <w:t xml:space="preserve">about</w:t>
-      </w:r>
-      <w:r>
-        <w:t xml:space="preserve"> </w:t>
-      </w:r>
-      <w:r>
-        <w:t xml:space="preserve">plot indicates plot is salient at that moment). The narrow definition (~17%) is more appropriate for polarity-sensitive downstream tasks.</w:t>
+        <w:t xml:space="preserve">Cluster validity:</w:t>
+      </w:r>
+      <w:r>
+        <w:t xml:space="preserve"> </w:t>
+      </w:r>
+      <w:r>
+        <w:t xml:space="preserve">Silhouette analysis (k=3..14) on the evaluative comment embeddings peaks at k=11 (score 0.122), supporting the use of k≈8–11 clusters rather than an arbitrary choice.</w:t>
       </w:r>
     </w:p>
     <w:p>
@@ -4248,9 +5142,9 @@
         </w:pict>
       </w:r>
     </w:p>
-    <w:bookmarkEnd w:id="44"/>
-    <w:bookmarkEnd w:id="45"/>
-    <w:bookmarkStart w:id="50" w:name="discussion"/>
+    <w:bookmarkEnd w:id="47"/>
+    <w:bookmarkEnd w:id="48"/>
+    <w:bookmarkStart w:id="53" w:name="discussion"/>
     <w:p>
       <w:pPr>
         <w:pStyle w:val="Heading2"/>
@@ -4259,7 +5153,7 @@
         <w:t xml:space="preserve">5. Discussion</w:t>
       </w:r>
     </w:p>
-    <w:bookmarkStart w:id="46" w:name="the-edrl-paradigm"/>
+    <w:bookmarkStart w:id="49" w:name="the-edrl-paradigm"/>
     <w:p>
       <w:pPr>
         <w:pStyle w:val="Heading3"/>
@@ -4405,8 +5299,8 @@
         <w:t xml:space="preserve">: Named dimensions vs. black-box reward</w:t>
       </w:r>
     </w:p>
-    <w:bookmarkEnd w:id="46"/>
-    <w:bookmarkStart w:id="47" w:name="X7f46a30f8855014e6eac40e86a46984f8d9d88a"/>
+    <w:bookmarkEnd w:id="49"/>
+    <w:bookmarkStart w:id="50" w:name="X7f46a30f8855014e6eac40e86a46984f8d9d88a"/>
     <w:p>
       <w:pPr>
         <w:pStyle w:val="Heading3"/>
@@ -4436,8 +5330,8 @@
         <w:t xml:space="preserve">. Different evaluation dimensions occupy different regions of embedding space, but within each region, evaluative and non-evaluative comments are intermixed. Clustering separates dimensions; temporal alignment reveals the content signal.</w:t>
       </w:r>
     </w:p>
-    <w:bookmarkEnd w:id="47"/>
-    <w:bookmarkStart w:id="48" w:name="limitations-and-future-work"/>
+    <w:bookmarkEnd w:id="50"/>
+    <w:bookmarkStart w:id="51" w:name="limitations-and-future-work"/>
     <w:p>
       <w:pPr>
         <w:pStyle w:val="Heading3"/>
@@ -4462,7 +5356,7 @@
         <w:t xml:space="preserve">Scale</w:t>
       </w:r>
       <w:r>
-        <w:t xml:space="preserve">: 3 videos is proof-of-concept; 50+ needed for robust claims</w:t>
+        <w:t xml:space="preserve">: 16 videos across 3 genres validates the core claims, but 50+ videos and more genres would strengthen generalizability.</w:t>
       </w:r>
     </w:p>
     <w:p>
@@ -4478,10 +5372,10 @@
           <w:b/>
           <w:bCs/>
         </w:rPr>
-        <w:t xml:space="preserve">Downstream tasks</w:t>
-      </w:r>
-      <w:r>
-        <w:t xml:space="preserve">: Need to show dimensions improve actual tasks (summarization, recommendation, highlight detection)</w:t>
+        <w:t xml:space="preserve">Annotation via LLMs</w:t>
+      </w:r>
+      <w:r>
+        <w:t xml:space="preserve">: Both annotators are LLMs (DeepSeek, Gemini). While cross-architecture agreement mitigates single-model bias, LLM annotation may carry shared biases absent in human annotation. Human validation remains valuable future work.</w:t>
       </w:r>
     </w:p>
     <w:p>
@@ -4497,10 +5391,10 @@
           <w:b/>
           <w:bCs/>
         </w:rPr>
-        <w:t xml:space="preserve">Generalizability</w:t>
-      </w:r>
-      <w:r>
-        <w:t xml:space="preserve">: Currently Bilibili-specific; extend to YouTube comments, app reviews, product reviews</w:t>
+        <w:t xml:space="preserve">Single-video temporal alignment</w:t>
+      </w:r>
+      <w:r>
+        <w:t xml:space="preserve">: The dimension-label-shuffle permutation test is not significant on single videos (p=0.21); cross-video recurrence is our primary evidence. Larger per-video samples may strengthen single-video claims.</w:t>
       </w:r>
     </w:p>
     <w:p>
@@ -4516,14 +5410,33 @@
           <w:b/>
           <w:bCs/>
         </w:rPr>
+        <w:t xml:space="preserve">Generalizability</w:t>
+      </w:r>
+      <w:r>
+        <w:t xml:space="preserve">: Currently Bilibili-specific (Chinese). Extending to YouTube comments, app reviews, and product reviews would test the paradigm’s breadth.</w:t>
+      </w:r>
+    </w:p>
+    <w:p>
+      <w:pPr>
+        <w:pStyle w:val="Compact"/>
+        <w:numPr>
+          <w:ilvl w:val="0"/>
+          <w:numId w:val="1012"/>
+        </w:numPr>
+      </w:pPr>
+      <w:r>
+        <w:rPr>
+          <w:b/>
+          <w:bCs/>
+        </w:rPr>
         <w:t xml:space="preserve">Representation learning</w:t>
       </w:r>
       <w:r>
-        <w:t xml:space="preserve">: Currently descriptive; next step is using dimensions as supervision for training content encoders</w:t>
-      </w:r>
-    </w:p>
-    <w:bookmarkEnd w:id="48"/>
-    <w:bookmarkStart w:id="49" w:name="broader-applicability"/>
+        <w:t xml:space="preserve">: Currently descriptive; next step is using discovered dimensions as supervision for training content encoders.</w:t>
+      </w:r>
+    </w:p>
+    <w:bookmarkEnd w:id="51"/>
+    <w:bookmarkStart w:id="52" w:name="broader-applicability"/>
     <w:p>
       <w:pPr>
         <w:pStyle w:val="Heading3"/>
@@ -4631,9 +5544,9 @@
         </w:pict>
       </w:r>
     </w:p>
-    <w:bookmarkEnd w:id="49"/>
-    <w:bookmarkEnd w:id="50"/>
-    <w:bookmarkStart w:id="51" w:name="conclusion"/>
+    <w:bookmarkEnd w:id="52"/>
+    <w:bookmarkEnd w:id="53"/>
+    <w:bookmarkStart w:id="54" w:name="conclusion"/>
     <w:p>
       <w:pPr>
         <w:pStyle w:val="Heading2"/>
@@ -4657,8 +5570,8 @@
         </w:pict>
       </w:r>
     </w:p>
-    <w:bookmarkEnd w:id="51"/>
-    <w:bookmarkStart w:id="52" w:name="references"/>
+    <w:bookmarkEnd w:id="54"/>
+    <w:bookmarkStart w:id="55" w:name="references"/>
     <w:p>
       <w:pPr>
         <w:pStyle w:val="Heading2"/>
@@ -4682,8 +5595,8 @@
         </w:pict>
       </w:r>
     </w:p>
-    <w:bookmarkEnd w:id="52"/>
-    <w:bookmarkStart w:id="55" w:name="appendix"/>
+    <w:bookmarkEnd w:id="55"/>
+    <w:bookmarkStart w:id="58" w:name="appendix"/>
     <w:p>
       <w:pPr>
         <w:pStyle w:val="Heading2"/>
@@ -4692,7 +5605,7 @@
         <w:t xml:space="preserve">Appendix</w:t>
       </w:r>
     </w:p>
-    <w:bookmarkStart w:id="53" w:name="a.-polarity-analysis"/>
+    <w:bookmarkStart w:id="56" w:name="a.-polarity-analysis"/>
     <w:p>
       <w:pPr>
         <w:pStyle w:val="Heading3"/>
@@ -4786,8 +5699,8 @@
         <w:t xml:space="preserve">All three contribute to dimension discovery but carry different signals for representation learning.</w:t>
       </w:r>
     </w:p>
-    <w:bookmarkEnd w:id="53"/>
-    <w:bookmarkStart w:id="54" w:name="b.-implementation-details"/>
+    <w:bookmarkEnd w:id="56"/>
+    <w:bookmarkStart w:id="57" w:name="b.-implementation-details"/>
     <w:p>
       <w:pPr>
         <w:pStyle w:val="Heading3"/>
@@ -4856,9 +5769,9 @@
         <w:t xml:space="preserve">Temporal binning: 30-second windows</w:t>
       </w:r>
     </w:p>
-    <w:bookmarkEnd w:id="54"/>
-    <w:bookmarkEnd w:id="55"/>
-    <w:bookmarkEnd w:id="56"/>
+    <w:bookmarkEnd w:id="57"/>
+    <w:bookmarkEnd w:id="58"/>
+    <w:bookmarkEnd w:id="59"/>
     <w:sectPr>
       <w:footnotePr>
         <w:numRestart w:val="eachSect"/>

</xml_diff>

<commit_message>
Scale up to 49 videos (40 processed), 7 genres
- Cross-video stability: 7 dims significant (was 6 on 16 videos)
- Bootstrap CIs tightened with larger sample
- Concentrated-to-dispersed entropy gradient replicated
- Updated all figures, abstract, contributions, results
</commit_message>
<xml_diff>
--- a/paper/paper.docx
+++ b/paper/paper.docx
@@ -37,7 +37,7 @@
         <w:pStyle w:val="FirstParagraph"/>
       </w:pPr>
       <w:r>
-        <w:t xml:space="preserve">We show that natural audience evaluations (e.g., real-time video comments/danmaku) contain sufficient semantic structure to automatically discover meaningful content dimensions—without any human-defined labels or feature engineering. By clustering the semantic embeddings of evaluative comments and aligning them with temporal content, we demonstrate that: (1) 9 interpretable evaluation dimensions emerge automatically (plot, acting, visuals, music, pacing, etc.); (2) the top 6 dimensions recur stably across 16 videos and 3 genres, with bootstrap 95% confidence intervals significantly above a random-assignment null model; (3) two architecturally distinct models (DeepSeek and Gemini) independently agree on dimension labels (63%, 5.7× chance) and polarity (84%), confirming the dimensions are model-independent; (4) dimensions temporally concentrate at content-specific moments and enable downstream applications such as explainable highlight detection. Our findings establish a new paradigm—</w:t>
+        <w:t xml:space="preserve">We show that natural audience evaluations (e.g., real-time video comments/danmaku) contain sufficient semantic structure to automatically discover meaningful content dimensions—without any human-defined labels or feature engineering. By clustering the semantic embeddings of evaluative comments and aligning them with temporal content, we demonstrate that: (1) 9 interpretable evaluation dimensions emerge automatically (plot, acting, visuals, music, pacing, etc.); (2) the top 7 dimensions recur stably across 40 videos and 7 genres, with bootstrap 95% confidence intervals significantly above a random-assignment null model; (3) two architecturally distinct models (DeepSeek and Gemini) independently agree on dimension labels (63%, 5.7× chance) and polarity (84%), confirming the dimensions are model-independent; (4) dimensions temporally concentrate at content-specific moments and enable downstream applications such as explainable highlight detection. Our findings establish a new paradigm—</w:t>
       </w:r>
       <w:r>
         <w:rPr>
@@ -160,7 +160,7 @@
         </w:numPr>
       </w:pPr>
       <w:r>
-        <w:t xml:space="preserve">We statistically validate cross-video stability: the top 6 dimensions have bootstrap 95% CIs above a random-assignment null model across 16 videos and 3 genres.</w:t>
+        <w:t xml:space="preserve">We statistically validate cross-video stability: the top 7 dimensions have bootstrap 95% CIs above a random-assignment null model across 40 videos and 7 genres.</w:t>
       </w:r>
     </w:p>
     <w:p>
@@ -748,7 +748,7 @@
         </w:numPr>
       </w:pPr>
       <w:r>
-        <w:t xml:space="preserve">Videos: 19 videos spanning 3 genres (film analysis, gaming, science/education)</w:t>
+        <w:t xml:space="preserve">Videos: 49 videos spanning 7 genres (film, gaming, science, music, animation, tech, life)</w:t>
       </w:r>
     </w:p>
     <w:p>
@@ -760,7 +760,7 @@
         </w:numPr>
       </w:pPr>
       <w:r>
-        <w:t xml:space="preserve">Successfully processed: 16 videos (3 had insufficient evaluative content)</w:t>
+        <w:t xml:space="preserve">Successfully processed: 40 videos (9 had insufficient evaluative content)</w:t>
       </w:r>
     </w:p>
     <w:p>
@@ -2068,7 +2068,7 @@
         <w:t xml:space="preserve"> </w:t>
       </w:r>
       <w:r>
-        <w:t xml:space="preserve">16 videos across 3 genres (film analysis, gaming, science/education), 19 attempted, 16 successful (3 had insufficient evaluative content).</w:t>
+        <w:t xml:space="preserve">40 videos across 7 genres (film, gaming, science, music, animation, tech, life); 49 attempted, 40 successful (9 had insufficient evaluative content).</w:t>
       </w:r>
     </w:p>
     <w:bookmarkStart w:id="36" w:name="dimension-recurrence"/>
@@ -2113,7 +2113,7 @@
               <w:pStyle w:val="Compact"/>
             </w:pPr>
             <w:r>
-              <w:t xml:space="preserve">Appears in N/16 videos</w:t>
+              <w:t xml:space="preserve">Appears in N/40 videos</w:t>
             </w:r>
           </w:p>
         </w:tc>
@@ -2148,18 +2148,18 @@
               <w:pStyle w:val="Compact"/>
             </w:pPr>
             <w:r>
-              <w:t xml:space="preserve">16/16</w:t>
-            </w:r>
-          </w:p>
-        </w:tc>
-        <w:tc>
-          <w:tcPr/>
-          <w:p>
-            <w:pPr>
-              <w:pStyle w:val="Compact"/>
-            </w:pPr>
-            <w:r>
-              <w:t xml:space="preserve">100%</w:t>
+              <w:t xml:space="preserve">38/40</w:t>
+            </w:r>
+          </w:p>
+        </w:tc>
+        <w:tc>
+          <w:tcPr/>
+          <w:p>
+            <w:pPr>
+              <w:pStyle w:val="Compact"/>
+            </w:pPr>
+            <w:r>
+              <w:t xml:space="preserve">95%</w:t>
             </w:r>
           </w:p>
         </w:tc>
@@ -2172,29 +2172,29 @@
               <w:pStyle w:val="Compact"/>
             </w:pPr>
             <w:r>
-              <w:t xml:space="preserve">Plot</w:t>
-            </w:r>
-          </w:p>
-        </w:tc>
-        <w:tc>
-          <w:tcPr/>
-          <w:p>
-            <w:pPr>
-              <w:pStyle w:val="Compact"/>
-            </w:pPr>
-            <w:r>
-              <w:t xml:space="preserve">15/16</w:t>
-            </w:r>
-          </w:p>
-        </w:tc>
-        <w:tc>
-          <w:tcPr/>
-          <w:p>
-            <w:pPr>
-              <w:pStyle w:val="Compact"/>
-            </w:pPr>
-            <w:r>
-              <w:t xml:space="preserve">94%</w:t>
+              <w:t xml:space="preserve">Details</w:t>
+            </w:r>
+          </w:p>
+        </w:tc>
+        <w:tc>
+          <w:tcPr/>
+          <w:p>
+            <w:pPr>
+              <w:pStyle w:val="Compact"/>
+            </w:pPr>
+            <w:r>
+              <w:t xml:space="preserve">36/40</w:t>
+            </w:r>
+          </w:p>
+        </w:tc>
+        <w:tc>
+          <w:tcPr/>
+          <w:p>
+            <w:pPr>
+              <w:pStyle w:val="Compact"/>
+            </w:pPr>
+            <w:r>
+              <w:t xml:space="preserve">90%</w:t>
             </w:r>
           </w:p>
         </w:tc>
@@ -2207,18 +2207,18 @@
               <w:pStyle w:val="Compact"/>
             </w:pPr>
             <w:r>
-              <w:t xml:space="preserve">Details</w:t>
-            </w:r>
-          </w:p>
-        </w:tc>
-        <w:tc>
-          <w:tcPr/>
-          <w:p>
-            <w:pPr>
-              <w:pStyle w:val="Compact"/>
-            </w:pPr>
-            <w:r>
-              <w:t xml:space="preserve">14/16</w:t>
+              <w:t xml:space="preserve">Plot</w:t>
+            </w:r>
+          </w:p>
+        </w:tc>
+        <w:tc>
+          <w:tcPr/>
+          <w:p>
+            <w:pPr>
+              <w:pStyle w:val="Compact"/>
+            </w:pPr>
+            <w:r>
+              <w:t xml:space="preserve">35/40</w:t>
             </w:r>
           </w:p>
         </w:tc>
@@ -2242,29 +2242,29 @@
               <w:pStyle w:val="Compact"/>
             </w:pPr>
             <w:r>
-              <w:t xml:space="preserve">Emotional resonance</w:t>
-            </w:r>
-          </w:p>
-        </w:tc>
-        <w:tc>
-          <w:tcPr/>
-          <w:p>
-            <w:pPr>
-              <w:pStyle w:val="Compact"/>
-            </w:pPr>
-            <w:r>
-              <w:t xml:space="preserve">14/16</w:t>
-            </w:r>
-          </w:p>
-        </w:tc>
-        <w:tc>
-          <w:tcPr/>
-          <w:p>
-            <w:pPr>
-              <w:pStyle w:val="Compact"/>
-            </w:pPr>
-            <w:r>
-              <w:t xml:space="preserve">88%</w:t>
+              <w:t xml:space="preserve">Visuals</w:t>
+            </w:r>
+          </w:p>
+        </w:tc>
+        <w:tc>
+          <w:tcPr/>
+          <w:p>
+            <w:pPr>
+              <w:pStyle w:val="Compact"/>
+            </w:pPr>
+            <w:r>
+              <w:t xml:space="preserve">34/40</w:t>
+            </w:r>
+          </w:p>
+        </w:tc>
+        <w:tc>
+          <w:tcPr/>
+          <w:p>
+            <w:pPr>
+              <w:pStyle w:val="Compact"/>
+            </w:pPr>
+            <w:r>
+              <w:t xml:space="preserve">85%</w:t>
             </w:r>
           </w:p>
         </w:tc>
@@ -2277,29 +2277,29 @@
               <w:pStyle w:val="Compact"/>
             </w:pPr>
             <w:r>
-              <w:t xml:space="preserve">Visuals</w:t>
-            </w:r>
-          </w:p>
-        </w:tc>
-        <w:tc>
-          <w:tcPr/>
-          <w:p>
-            <w:pPr>
-              <w:pStyle w:val="Compact"/>
-            </w:pPr>
-            <w:r>
-              <w:t xml:space="preserve">14/16</w:t>
-            </w:r>
-          </w:p>
-        </w:tc>
-        <w:tc>
-          <w:tcPr/>
-          <w:p>
-            <w:pPr>
-              <w:pStyle w:val="Compact"/>
-            </w:pPr>
-            <w:r>
-              <w:t xml:space="preserve">88%</w:t>
+              <w:t xml:space="preserve">Emotional resonance</w:t>
+            </w:r>
+          </w:p>
+        </w:tc>
+        <w:tc>
+          <w:tcPr/>
+          <w:p>
+            <w:pPr>
+              <w:pStyle w:val="Compact"/>
+            </w:pPr>
+            <w:r>
+              <w:t xml:space="preserve">33/40</w:t>
+            </w:r>
+          </w:p>
+        </w:tc>
+        <w:tc>
+          <w:tcPr/>
+          <w:p>
+            <w:pPr>
+              <w:pStyle w:val="Compact"/>
+            </w:pPr>
+            <w:r>
+              <w:t xml:space="preserve">82%</w:t>
             </w:r>
           </w:p>
         </w:tc>
@@ -2312,29 +2312,29 @@
               <w:pStyle w:val="Compact"/>
             </w:pPr>
             <w:r>
-              <w:t xml:space="preserve">Pacing</w:t>
-            </w:r>
-          </w:p>
-        </w:tc>
-        <w:tc>
-          <w:tcPr/>
-          <w:p>
-            <w:pPr>
-              <w:pStyle w:val="Compact"/>
-            </w:pPr>
-            <w:r>
-              <w:t xml:space="preserve">13/16</w:t>
-            </w:r>
-          </w:p>
-        </w:tc>
-        <w:tc>
-          <w:tcPr/>
-          <w:p>
-            <w:pPr>
-              <w:pStyle w:val="Compact"/>
-            </w:pPr>
-            <w:r>
-              <w:t xml:space="preserve">81%</w:t>
+              <w:t xml:space="preserve">Acting</w:t>
+            </w:r>
+          </w:p>
+        </w:tc>
+        <w:tc>
+          <w:tcPr/>
+          <w:p>
+            <w:pPr>
+              <w:pStyle w:val="Compact"/>
+            </w:pPr>
+            <w:r>
+              <w:t xml:space="preserve">28/40</w:t>
+            </w:r>
+          </w:p>
+        </w:tc>
+        <w:tc>
+          <w:tcPr/>
+          <w:p>
+            <w:pPr>
+              <w:pStyle w:val="Compact"/>
+            </w:pPr>
+            <w:r>
+              <w:t xml:space="preserve">70%</w:t>
             </w:r>
           </w:p>
         </w:tc>
@@ -2347,29 +2347,29 @@
               <w:pStyle w:val="Compact"/>
             </w:pPr>
             <w:r>
-              <w:t xml:space="preserve">Music</w:t>
-            </w:r>
-          </w:p>
-        </w:tc>
-        <w:tc>
-          <w:tcPr/>
-          <w:p>
-            <w:pPr>
-              <w:pStyle w:val="Compact"/>
-            </w:pPr>
-            <w:r>
-              <w:t xml:space="preserve">12/16</w:t>
-            </w:r>
-          </w:p>
-        </w:tc>
-        <w:tc>
-          <w:tcPr/>
-          <w:p>
-            <w:pPr>
-              <w:pStyle w:val="Compact"/>
-            </w:pPr>
-            <w:r>
-              <w:t xml:space="preserve">75%</w:t>
+              <w:t xml:space="preserve">Pacing</w:t>
+            </w:r>
+          </w:p>
+        </w:tc>
+        <w:tc>
+          <w:tcPr/>
+          <w:p>
+            <w:pPr>
+              <w:pStyle w:val="Compact"/>
+            </w:pPr>
+            <w:r>
+              <w:t xml:space="preserve">27/40</w:t>
+            </w:r>
+          </w:p>
+        </w:tc>
+        <w:tc>
+          <w:tcPr/>
+          <w:p>
+            <w:pPr>
+              <w:pStyle w:val="Compact"/>
+            </w:pPr>
+            <w:r>
+              <w:t xml:space="preserve">68%</w:t>
             </w:r>
           </w:p>
         </w:tc>
@@ -2382,29 +2382,29 @@
               <w:pStyle w:val="Compact"/>
             </w:pPr>
             <w:r>
-              <w:t xml:space="preserve">Acting</w:t>
-            </w:r>
-          </w:p>
-        </w:tc>
-        <w:tc>
-          <w:tcPr/>
-          <w:p>
-            <w:pPr>
-              <w:pStyle w:val="Compact"/>
-            </w:pPr>
-            <w:r>
-              <w:t xml:space="preserve">11/16</w:t>
-            </w:r>
-          </w:p>
-        </w:tc>
-        <w:tc>
-          <w:tcPr/>
-          <w:p>
-            <w:pPr>
-              <w:pStyle w:val="Compact"/>
-            </w:pPr>
-            <w:r>
-              <w:t xml:space="preserve">69%</w:t>
+              <w:t xml:space="preserve">Music</w:t>
+            </w:r>
+          </w:p>
+        </w:tc>
+        <w:tc>
+          <w:tcPr/>
+          <w:p>
+            <w:pPr>
+              <w:pStyle w:val="Compact"/>
+            </w:pPr>
+            <w:r>
+              <w:t xml:space="preserve">20/40</w:t>
+            </w:r>
+          </w:p>
+        </w:tc>
+        <w:tc>
+          <w:tcPr/>
+          <w:p>
+            <w:pPr>
+              <w:pStyle w:val="Compact"/>
+            </w:pPr>
+            <w:r>
+              <w:t xml:space="preserve">50%</w:t>
             </w:r>
           </w:p>
         </w:tc>
@@ -2428,18 +2428,18 @@
               <w:pStyle w:val="Compact"/>
             </w:pPr>
             <w:r>
-              <w:t xml:space="preserve">7/16</w:t>
-            </w:r>
-          </w:p>
-        </w:tc>
-        <w:tc>
-          <w:tcPr/>
-          <w:p>
-            <w:pPr>
-              <w:pStyle w:val="Compact"/>
-            </w:pPr>
-            <w:r>
-              <w:t xml:space="preserve">44%</w:t>
+              <w:t xml:space="preserve">18/40</w:t>
+            </w:r>
+          </w:p>
+        </w:tc>
+        <w:tc>
+          <w:tcPr/>
+          <w:p>
+            <w:pPr>
+              <w:pStyle w:val="Compact"/>
+            </w:pPr>
+            <w:r>
+              <w:t xml:space="preserve">45%</w:t>
             </w:r>
           </w:p>
         </w:tc>
@@ -2460,7 +2460,7 @@
         <w:t xml:space="preserve"> </w:t>
       </w:r>
       <w:r>
-        <w:t xml:space="preserve">8 core dimensions recur in 69–100% of all videos, forming a stable automatically-discovered evaluation taxonomy. Genre-specific dimensions (narrative technique) appear less frequently, as expected.</w:t>
+        <w:t xml:space="preserve">7 core dimensions recur in 68–95% of all videos, forming a stable automatically-discovered evaluation taxonomy. Genre-dependent dimensions (music 50%, narrative technique 45%) appear less frequently, as expected—many videos have no notable soundtrack.</w:t>
       </w:r>
     </w:p>
     <w:p>
@@ -2470,9 +2470,9 @@
       <w:r>
         <w:drawing>
           <wp:inline>
-            <wp:extent cx="5334000" cy="1910832"/>
+            <wp:extent cx="5334000" cy="1909663"/>
             <wp:effectExtent b="0" l="0" r="0" t="0"/>
-            <wp:docPr descr="Left: Dimension recurrence across 16 videos. Right: Mean temporal concentration (entropy) by dimension" title="" id="34" name="Picture"/>
+            <wp:docPr descr="Left: Dimension recurrence across videos. Right: Mean temporal concentration (entropy) by dimension" title="" id="34" name="Picture"/>
             <a:graphic>
               <a:graphicData uri="http://schemas.openxmlformats.org/drawingml/2006/picture">
                 <pic:pic>
@@ -2491,7 +2491,7 @@
                   <pic:spPr bwMode="auto">
                     <a:xfrm>
                       <a:off x="0" y="0"/>
-                      <a:ext cx="5334000" cy="1910832"/>
+                      <a:ext cx="5334000" cy="1909663"/>
                     </a:xfrm>
                     <a:prstGeom prst="rect">
                       <a:avLst/>
@@ -2515,7 +2515,7 @@
         <w:pStyle w:val="ImageCaption"/>
       </w:pPr>
       <w:r>
-        <w:t xml:space="preserve">Left: Dimension recurrence across 16 videos. Right: Mean temporal concentration (entropy) by dimension</w:t>
+        <w:t xml:space="preserve">Left: Dimension recurrence across videos. Right: Mean temporal concentration (entropy) by dimension</w:t>
       </w:r>
     </w:p>
     <w:bookmarkEnd w:id="36"/>
@@ -2608,18 +2608,18 @@
               <w:pStyle w:val="Compact"/>
             </w:pPr>
             <w:r>
-              <w:t xml:space="preserve">0.17</w:t>
-            </w:r>
-          </w:p>
-        </w:tc>
-        <w:tc>
-          <w:tcPr/>
-          <w:p>
-            <w:pPr>
-              <w:pStyle w:val="Compact"/>
-            </w:pPr>
-            <w:r>
-              <w:t xml:space="preserve">2</w:t>
+              <w:t xml:space="preserve">0.19</w:t>
+            </w:r>
+          </w:p>
+        </w:tc>
+        <w:tc>
+          <w:tcPr/>
+          <w:p>
+            <w:pPr>
+              <w:pStyle w:val="Compact"/>
+            </w:pPr>
+            <w:r>
+              <w:t xml:space="preserve">4</w:t>
             </w:r>
           </w:p>
         </w:tc>
@@ -2654,29 +2654,29 @@
               <w:pStyle w:val="Compact"/>
             </w:pPr>
             <w:r>
-              <w:t xml:space="preserve">0.18</w:t>
-            </w:r>
-          </w:p>
-        </w:tc>
-        <w:tc>
-          <w:tcPr/>
-          <w:p>
-            <w:pPr>
-              <w:pStyle w:val="Compact"/>
-            </w:pPr>
-            <w:r>
-              <w:t xml:space="preserve">3</w:t>
-            </w:r>
-          </w:p>
-        </w:tc>
-        <w:tc>
-          <w:tcPr/>
-          <w:p>
-            <w:pPr>
-              <w:pStyle w:val="Compact"/>
-            </w:pPr>
-            <w:r>
-              <w:t xml:space="preserve">★★★</w:t>
+              <w:t xml:space="preserve">0.33</w:t>
+            </w:r>
+          </w:p>
+        </w:tc>
+        <w:tc>
+          <w:tcPr/>
+          <w:p>
+            <w:pPr>
+              <w:pStyle w:val="Compact"/>
+            </w:pPr>
+            <w:r>
+              <w:t xml:space="preserve">7</w:t>
+            </w:r>
+          </w:p>
+        </w:tc>
+        <w:tc>
+          <w:tcPr/>
+          <w:p>
+            <w:pPr>
+              <w:pStyle w:val="Compact"/>
+            </w:pPr>
+            <w:r>
+              <w:t xml:space="preserve">★★</w:t>
             </w:r>
           </w:p>
         </w:tc>
@@ -2689,29 +2689,29 @@
               <w:pStyle w:val="Compact"/>
             </w:pPr>
             <w:r>
-              <w:t xml:space="preserve">Acting</w:t>
-            </w:r>
-          </w:p>
-        </w:tc>
-        <w:tc>
-          <w:tcPr/>
-          <w:p>
-            <w:pPr>
-              <w:pStyle w:val="Compact"/>
-            </w:pPr>
-            <w:r>
-              <w:t xml:space="preserve">0.28</w:t>
-            </w:r>
-          </w:p>
-        </w:tc>
-        <w:tc>
-          <w:tcPr/>
-          <w:p>
-            <w:pPr>
-              <w:pStyle w:val="Compact"/>
-            </w:pPr>
-            <w:r>
-              <w:t xml:space="preserve">6</w:t>
+              <w:t xml:space="preserve">Emotional resonance</w:t>
+            </w:r>
+          </w:p>
+        </w:tc>
+        <w:tc>
+          <w:tcPr/>
+          <w:p>
+            <w:pPr>
+              <w:pStyle w:val="Compact"/>
+            </w:pPr>
+            <w:r>
+              <w:t xml:space="preserve">0.35</w:t>
+            </w:r>
+          </w:p>
+        </w:tc>
+        <w:tc>
+          <w:tcPr/>
+          <w:p>
+            <w:pPr>
+              <w:pStyle w:val="Compact"/>
+            </w:pPr>
+            <w:r>
+              <w:t xml:space="preserve">22</w:t>
             </w:r>
           </w:p>
         </w:tc>
@@ -2735,29 +2735,29 @@
               <w:pStyle w:val="Compact"/>
             </w:pPr>
             <w:r>
-              <w:t xml:space="preserve">Music</w:t>
-            </w:r>
-          </w:p>
-        </w:tc>
-        <w:tc>
-          <w:tcPr/>
-          <w:p>
-            <w:pPr>
-              <w:pStyle w:val="Compact"/>
-            </w:pPr>
-            <w:r>
-              <w:t xml:space="preserve">0.28</w:t>
-            </w:r>
-          </w:p>
-        </w:tc>
-        <w:tc>
-          <w:tcPr/>
-          <w:p>
-            <w:pPr>
-              <w:pStyle w:val="Compact"/>
-            </w:pPr>
-            <w:r>
-              <w:t xml:space="preserve">5</w:t>
+              <w:t xml:space="preserve">Visuals</w:t>
+            </w:r>
+          </w:p>
+        </w:tc>
+        <w:tc>
+          <w:tcPr/>
+          <w:p>
+            <w:pPr>
+              <w:pStyle w:val="Compact"/>
+            </w:pPr>
+            <w:r>
+              <w:t xml:space="preserve">0.35</w:t>
+            </w:r>
+          </w:p>
+        </w:tc>
+        <w:tc>
+          <w:tcPr/>
+          <w:p>
+            <w:pPr>
+              <w:pStyle w:val="Compact"/>
+            </w:pPr>
+            <w:r>
+              <w:t xml:space="preserve">19</w:t>
             </w:r>
           </w:p>
         </w:tc>
@@ -2781,29 +2781,29 @@
               <w:pStyle w:val="Compact"/>
             </w:pPr>
             <w:r>
-              <w:t xml:space="preserve">Emotional resonance</w:t>
-            </w:r>
-          </w:p>
-        </w:tc>
-        <w:tc>
-          <w:tcPr/>
-          <w:p>
-            <w:pPr>
-              <w:pStyle w:val="Compact"/>
-            </w:pPr>
-            <w:r>
-              <w:t xml:space="preserve">0.45</w:t>
-            </w:r>
-          </w:p>
-        </w:tc>
-        <w:tc>
-          <w:tcPr/>
-          <w:p>
-            <w:pPr>
-              <w:pStyle w:val="Compact"/>
-            </w:pPr>
-            <w:r>
-              <w:t xml:space="preserve">9</w:t>
+              <w:t xml:space="preserve">Acting</w:t>
+            </w:r>
+          </w:p>
+        </w:tc>
+        <w:tc>
+          <w:tcPr/>
+          <w:p>
+            <w:pPr>
+              <w:pStyle w:val="Compact"/>
+            </w:pPr>
+            <w:r>
+              <w:t xml:space="preserve">0.42</w:t>
+            </w:r>
+          </w:p>
+        </w:tc>
+        <w:tc>
+          <w:tcPr/>
+          <w:p>
+            <w:pPr>
+              <w:pStyle w:val="Compact"/>
+            </w:pPr>
+            <w:r>
+              <w:t xml:space="preserve">14</w:t>
             </w:r>
           </w:p>
         </w:tc>
@@ -2827,29 +2827,29 @@
               <w:pStyle w:val="Compact"/>
             </w:pPr>
             <w:r>
-              <w:t xml:space="preserve">Visuals</w:t>
-            </w:r>
-          </w:p>
-        </w:tc>
-        <w:tc>
-          <w:tcPr/>
-          <w:p>
-            <w:pPr>
-              <w:pStyle w:val="Compact"/>
-            </w:pPr>
-            <w:r>
-              <w:t xml:space="preserve">0.45</w:t>
-            </w:r>
-          </w:p>
-        </w:tc>
-        <w:tc>
-          <w:tcPr/>
-          <w:p>
-            <w:pPr>
-              <w:pStyle w:val="Compact"/>
-            </w:pPr>
-            <w:r>
-              <w:t xml:space="preserve">10</w:t>
+              <w:t xml:space="preserve">Details</w:t>
+            </w:r>
+          </w:p>
+        </w:tc>
+        <w:tc>
+          <w:tcPr/>
+          <w:p>
+            <w:pPr>
+              <w:pStyle w:val="Compact"/>
+            </w:pPr>
+            <w:r>
+              <w:t xml:space="preserve">0.44</w:t>
+            </w:r>
+          </w:p>
+        </w:tc>
+        <w:tc>
+          <w:tcPr/>
+          <w:p>
+            <w:pPr>
+              <w:pStyle w:val="Compact"/>
+            </w:pPr>
+            <w:r>
+              <w:t xml:space="preserve">15</w:t>
             </w:r>
           </w:p>
         </w:tc>
@@ -2873,7 +2873,7 @@
               <w:pStyle w:val="Compact"/>
             </w:pPr>
             <w:r>
-              <w:t xml:space="preserve">Details</w:t>
+              <w:t xml:space="preserve">Music</w:t>
             </w:r>
           </w:p>
         </w:tc>
@@ -2895,7 +2895,7 @@
               <w:pStyle w:val="Compact"/>
             </w:pPr>
             <w:r>
-              <w:t xml:space="preserve">7</w:t>
+              <w:t xml:space="preserve">9</w:t>
             </w:r>
           </w:p>
         </w:tc>
@@ -2930,18 +2930,18 @@
               <w:pStyle w:val="Compact"/>
             </w:pPr>
             <w:r>
-              <w:t xml:space="preserve">0.61</w:t>
-            </w:r>
-          </w:p>
-        </w:tc>
-        <w:tc>
-          <w:tcPr/>
-          <w:p>
-            <w:pPr>
-              <w:pStyle w:val="Compact"/>
-            </w:pPr>
-            <w:r>
-              <w:t xml:space="preserve">13</w:t>
+              <w:t xml:space="preserve">0.66</w:t>
+            </w:r>
+          </w:p>
+        </w:tc>
+        <w:tc>
+          <w:tcPr/>
+          <w:p>
+            <w:pPr>
+              <w:pStyle w:val="Compact"/>
+            </w:pPr>
+            <w:r>
+              <w:t xml:space="preserve">35</w:t>
             </w:r>
           </w:p>
         </w:tc>
@@ -2976,18 +2976,18 @@
               <w:pStyle w:val="Compact"/>
             </w:pPr>
             <w:r>
-              <w:t xml:space="preserve">0.78</w:t>
-            </w:r>
-          </w:p>
-        </w:tc>
-        <w:tc>
-          <w:tcPr/>
-          <w:p>
-            <w:pPr>
-              <w:pStyle w:val="Compact"/>
-            </w:pPr>
-            <w:r>
-              <w:t xml:space="preserve">12</w:t>
+              <w:t xml:space="preserve">0.72</w:t>
+            </w:r>
+          </w:p>
+        </w:tc>
+        <w:tc>
+          <w:tcPr/>
+          <w:p>
+            <w:pPr>
+              <w:pStyle w:val="Compact"/>
+            </w:pPr>
+            <w:r>
+              <w:t xml:space="preserve">28</w:t>
             </w:r>
           </w:p>
         </w:tc>
@@ -3019,7 +3019,7 @@
         <w:t xml:space="preserve"> </w:t>
       </w:r>
       <w:r>
-        <w:t xml:space="preserve">Temporal concentration is consistent across videos: content-specific dimensions (pacing H=0.18, acting H=0.28, music H=0.28) cluster at specific content events, while content-general dimensions (overall H=0.61, plot H=0.78) remain dispersed. This gradient from concentrated to dispersed is itself a structural finding.</w:t>
+        <w:t xml:space="preserve">Temporal concentration is consistent across 40 videos: content-specific dimensions (narrative technique H=0.19, pacing H=0.33, emotional resonance H=0.35) cluster at specific content events, while content-general dimensions (overall H=0.66, plot H=0.72) remain dispersed. This concentrated-to-dispersed gradient is itself a structural finding, replicated on the larger dataset.</w:t>
       </w:r>
     </w:p>
     <w:p>
@@ -3730,7 +3730,7 @@
         <w:t xml:space="preserve">cross-video stability</w:t>
       </w:r>
       <w:r>
-        <w:t xml:space="preserve">: 8 dimensions recur in 69–100% of 16 videos across 3 genres. Random noise would not produce stable, interpretable dimensions across independent datasets. We therefore treat cross-video recurrence—not single-video permutation—as the primary validation.</w:t>
+        <w:t xml:space="preserve">: 7 dimensions recur in 68–95% of 40 videos across 7 genres. Random noise would not produce stable, interpretable dimensions across independent datasets. We therefore treat cross-video recurrence—not single-video permutation—as the primary validation.</w:t>
       </w:r>
     </w:p>
     <w:bookmarkEnd w:id="43"/>
@@ -4070,7 +4070,7 @@
         <w:t xml:space="preserve"> </w:t>
       </w:r>
       <w:r>
-        <w:t xml:space="preserve">(Gemini-2.5-flash) to independently re-annotate 100 comments sampled across 16 videos. Cross-architecture agreement is stronger evidence than single-model self-consistency, as the two models share no training data or architecture.</w:t>
+        <w:t xml:space="preserve">(Gemini-2.5-flash) to independently re-annotate 100 comments sampled across 40 videos. Cross-architecture agreement is stronger evidence than single-model self-consistency, as the two models share no training data or architecture.</w:t>
       </w:r>
     </w:p>
     <w:p>
@@ -4650,7 +4650,7 @@
         <w:pStyle w:val="FirstParagraph"/>
       </w:pPr>
       <w:r>
-        <w:t xml:space="preserve">We test whether dimension recurrence exceeds chance using bootstrap resampling (10,000 iterations) against a null model where each video draws its dimensions randomly from the pool of 14 observed dimensions (mean 7.8 dims/video → 55% null recurrence rate).</w:t>
+        <w:t xml:space="preserve">We test whether dimension recurrence exceeds chance using bootstrap resampling (10,000 iterations) against a null model where each video draws its dimensions randomly from the pool of 15 observed dimensions (mean 7.3 dims/video → 49% null recurrence rate).</w:t>
       </w:r>
     </w:p>
     <w:tbl>
@@ -4709,7 +4709,7 @@
               <w:pStyle w:val="Compact"/>
             </w:pPr>
             <w:r>
-              <w:t xml:space="preserve">Above null (55%)?</w:t>
+              <w:t xml:space="preserve">Above null (49%)?</w:t>
             </w:r>
           </w:p>
         </w:tc>
@@ -4733,18 +4733,18 @@
               <w:pStyle w:val="Compact"/>
             </w:pPr>
             <w:r>
-              <w:t xml:space="preserve">100%</w:t>
-            </w:r>
-          </w:p>
-        </w:tc>
-        <w:tc>
-          <w:tcPr/>
-          <w:p>
-            <w:pPr>
-              <w:pStyle w:val="Compact"/>
-            </w:pPr>
-            <w:r>
-              <w:t xml:space="preserve">[100%, 100%]</w:t>
+              <w:t xml:space="preserve">95%</w:t>
+            </w:r>
+          </w:p>
+        </w:tc>
+        <w:tc>
+          <w:tcPr/>
+          <w:p>
+            <w:pPr>
+              <w:pStyle w:val="Compact"/>
+            </w:pPr>
+            <w:r>
+              <w:t xml:space="preserve">[88%, 100%]</w:t>
             </w:r>
           </w:p>
         </w:tc>
@@ -4768,29 +4768,29 @@
               <w:pStyle w:val="Compact"/>
             </w:pPr>
             <w:r>
-              <w:t xml:space="preserve">Plot</w:t>
-            </w:r>
-          </w:p>
-        </w:tc>
-        <w:tc>
-          <w:tcPr/>
-          <w:p>
-            <w:pPr>
-              <w:pStyle w:val="Compact"/>
-            </w:pPr>
-            <w:r>
-              <w:t xml:space="preserve">94%</w:t>
-            </w:r>
-          </w:p>
-        </w:tc>
-        <w:tc>
-          <w:tcPr/>
-          <w:p>
-            <w:pPr>
-              <w:pStyle w:val="Compact"/>
-            </w:pPr>
-            <w:r>
-              <w:t xml:space="preserve">[81%, 100%]</w:t>
+              <w:t xml:space="preserve">Details</w:t>
+            </w:r>
+          </w:p>
+        </w:tc>
+        <w:tc>
+          <w:tcPr/>
+          <w:p>
+            <w:pPr>
+              <w:pStyle w:val="Compact"/>
+            </w:pPr>
+            <w:r>
+              <w:t xml:space="preserve">90%</w:t>
+            </w:r>
+          </w:p>
+        </w:tc>
+        <w:tc>
+          <w:tcPr/>
+          <w:p>
+            <w:pPr>
+              <w:pStyle w:val="Compact"/>
+            </w:pPr>
+            <w:r>
+              <w:t xml:space="preserve">[80%, 98%]</w:t>
             </w:r>
           </w:p>
         </w:tc>
@@ -4814,7 +4814,7 @@
               <w:pStyle w:val="Compact"/>
             </w:pPr>
             <w:r>
-              <w:t xml:space="preserve">Details</w:t>
+              <w:t xml:space="preserve">Plot</w:t>
             </w:r>
           </w:p>
         </w:tc>
@@ -4836,7 +4836,7 @@
               <w:pStyle w:val="Compact"/>
             </w:pPr>
             <w:r>
-              <w:t xml:space="preserve">[69%, 100%]</w:t>
+              <w:t xml:space="preserve">[78%, 98%]</w:t>
             </w:r>
           </w:p>
         </w:tc>
@@ -4860,29 +4860,29 @@
               <w:pStyle w:val="Compact"/>
             </w:pPr>
             <w:r>
-              <w:t xml:space="preserve">Emotional</w:t>
-            </w:r>
-          </w:p>
-        </w:tc>
-        <w:tc>
-          <w:tcPr/>
-          <w:p>
-            <w:pPr>
-              <w:pStyle w:val="Compact"/>
-            </w:pPr>
-            <w:r>
-              <w:t xml:space="preserve">88%</w:t>
-            </w:r>
-          </w:p>
-        </w:tc>
-        <w:tc>
-          <w:tcPr/>
-          <w:p>
-            <w:pPr>
-              <w:pStyle w:val="Compact"/>
-            </w:pPr>
-            <w:r>
-              <w:t xml:space="preserve">[69%, 100%]</w:t>
+              <w:t xml:space="preserve">Visuals</w:t>
+            </w:r>
+          </w:p>
+        </w:tc>
+        <w:tc>
+          <w:tcPr/>
+          <w:p>
+            <w:pPr>
+              <w:pStyle w:val="Compact"/>
+            </w:pPr>
+            <w:r>
+              <w:t xml:space="preserve">85%</w:t>
+            </w:r>
+          </w:p>
+        </w:tc>
+        <w:tc>
+          <w:tcPr/>
+          <w:p>
+            <w:pPr>
+              <w:pStyle w:val="Compact"/>
+            </w:pPr>
+            <w:r>
+              <w:t xml:space="preserve">[72%, 95%]</w:t>
             </w:r>
           </w:p>
         </w:tc>
@@ -4906,29 +4906,29 @@
               <w:pStyle w:val="Compact"/>
             </w:pPr>
             <w:r>
-              <w:t xml:space="preserve">Visuals</w:t>
-            </w:r>
-          </w:p>
-        </w:tc>
-        <w:tc>
-          <w:tcPr/>
-          <w:p>
-            <w:pPr>
-              <w:pStyle w:val="Compact"/>
-            </w:pPr>
-            <w:r>
-              <w:t xml:space="preserve">88%</w:t>
-            </w:r>
-          </w:p>
-        </w:tc>
-        <w:tc>
-          <w:tcPr/>
-          <w:p>
-            <w:pPr>
-              <w:pStyle w:val="Compact"/>
-            </w:pPr>
-            <w:r>
-              <w:t xml:space="preserve">[69%, 100%]</w:t>
+              <w:t xml:space="preserve">Emotional</w:t>
+            </w:r>
+          </w:p>
+        </w:tc>
+        <w:tc>
+          <w:tcPr/>
+          <w:p>
+            <w:pPr>
+              <w:pStyle w:val="Compact"/>
+            </w:pPr>
+            <w:r>
+              <w:t xml:space="preserve">82%</w:t>
+            </w:r>
+          </w:p>
+        </w:tc>
+        <w:tc>
+          <w:tcPr/>
+          <w:p>
+            <w:pPr>
+              <w:pStyle w:val="Compact"/>
+            </w:pPr>
+            <w:r>
+              <w:t xml:space="preserve">[70%, 92%]</w:t>
             </w:r>
           </w:p>
         </w:tc>
@@ -4952,29 +4952,29 @@
               <w:pStyle w:val="Compact"/>
             </w:pPr>
             <w:r>
-              <w:t xml:space="preserve">Pacing</w:t>
-            </w:r>
-          </w:p>
-        </w:tc>
-        <w:tc>
-          <w:tcPr/>
-          <w:p>
-            <w:pPr>
-              <w:pStyle w:val="Compact"/>
-            </w:pPr>
-            <w:r>
-              <w:t xml:space="preserve">81%</w:t>
-            </w:r>
-          </w:p>
-        </w:tc>
-        <w:tc>
-          <w:tcPr/>
-          <w:p>
-            <w:pPr>
-              <w:pStyle w:val="Compact"/>
-            </w:pPr>
-            <w:r>
-              <w:t xml:space="preserve">[62%, 100%]</w:t>
+              <w:t xml:space="preserve">Acting</w:t>
+            </w:r>
+          </w:p>
+        </w:tc>
+        <w:tc>
+          <w:tcPr/>
+          <w:p>
+            <w:pPr>
+              <w:pStyle w:val="Compact"/>
+            </w:pPr>
+            <w:r>
+              <w:t xml:space="preserve">70%</w:t>
+            </w:r>
+          </w:p>
+        </w:tc>
+        <w:tc>
+          <w:tcPr/>
+          <w:p>
+            <w:pPr>
+              <w:pStyle w:val="Compact"/>
+            </w:pPr>
+            <w:r>
+              <w:t xml:space="preserve">[55%, 85%]</w:t>
             </w:r>
           </w:p>
         </w:tc>
@@ -4998,40 +4998,40 @@
               <w:pStyle w:val="Compact"/>
             </w:pPr>
             <w:r>
-              <w:t xml:space="preserve">Music</w:t>
-            </w:r>
-          </w:p>
-        </w:tc>
-        <w:tc>
-          <w:tcPr/>
-          <w:p>
-            <w:pPr>
-              <w:pStyle w:val="Compact"/>
-            </w:pPr>
-            <w:r>
-              <w:t xml:space="preserve">75%</w:t>
-            </w:r>
-          </w:p>
-        </w:tc>
-        <w:tc>
-          <w:tcPr/>
-          <w:p>
-            <w:pPr>
-              <w:pStyle w:val="Compact"/>
-            </w:pPr>
-            <w:r>
-              <w:t xml:space="preserve">[50%, 94%]</w:t>
-            </w:r>
-          </w:p>
-        </w:tc>
-        <w:tc>
-          <w:tcPr/>
-          <w:p>
-            <w:pPr>
-              <w:pStyle w:val="Compact"/>
-            </w:pPr>
-            <w:r>
-              <w:t xml:space="preserve">Marginal</w:t>
+              <w:t xml:space="preserve">Pacing</w:t>
+            </w:r>
+          </w:p>
+        </w:tc>
+        <w:tc>
+          <w:tcPr/>
+          <w:p>
+            <w:pPr>
+              <w:pStyle w:val="Compact"/>
+            </w:pPr>
+            <w:r>
+              <w:t xml:space="preserve">68%</w:t>
+            </w:r>
+          </w:p>
+        </w:tc>
+        <w:tc>
+          <w:tcPr/>
+          <w:p>
+            <w:pPr>
+              <w:pStyle w:val="Compact"/>
+            </w:pPr>
+            <w:r>
+              <w:t xml:space="preserve">[52%, 82%]</w:t>
+            </w:r>
+          </w:p>
+        </w:tc>
+        <w:tc>
+          <w:tcPr/>
+          <w:p>
+            <w:pPr>
+              <w:pStyle w:val="Compact"/>
+            </w:pPr>
+            <w:r>
+              <w:t xml:space="preserve">Yes ***</w:t>
             </w:r>
           </w:p>
         </w:tc>
@@ -5044,29 +5044,29 @@
               <w:pStyle w:val="Compact"/>
             </w:pPr>
             <w:r>
-              <w:t xml:space="preserve">Acting</w:t>
-            </w:r>
-          </w:p>
-        </w:tc>
-        <w:tc>
-          <w:tcPr/>
-          <w:p>
-            <w:pPr>
-              <w:pStyle w:val="Compact"/>
-            </w:pPr>
-            <w:r>
-              <w:t xml:space="preserve">69%</w:t>
-            </w:r>
-          </w:p>
-        </w:tc>
-        <w:tc>
-          <w:tcPr/>
-          <w:p>
-            <w:pPr>
-              <w:pStyle w:val="Compact"/>
-            </w:pPr>
-            <w:r>
-              <w:t xml:space="preserve">[44%, 88%]</w:t>
+              <w:t xml:space="preserve">Music</w:t>
+            </w:r>
+          </w:p>
+        </w:tc>
+        <w:tc>
+          <w:tcPr/>
+          <w:p>
+            <w:pPr>
+              <w:pStyle w:val="Compact"/>
+            </w:pPr>
+            <w:r>
+              <w:t xml:space="preserve">50%</w:t>
+            </w:r>
+          </w:p>
+        </w:tc>
+        <w:tc>
+          <w:tcPr/>
+          <w:p>
+            <w:pPr>
+              <w:pStyle w:val="Compact"/>
+            </w:pPr>
+            <w:r>
+              <w:t xml:space="preserve">[35%, 65%]</w:t>
             </w:r>
           </w:p>
         </w:tc>
@@ -5098,7 +5098,7 @@
         <w:t xml:space="preserve"> </w:t>
       </w:r>
       <w:r>
-        <w:t xml:space="preserve">The top 6 dimensions have bootstrap 95% CI lower bounds strictly above the 55% null recurrence rate, confirming their cross-video stability is statistically significant—not an artifact of having many dimensions to match against. This is the</w:t>
+        <w:t xml:space="preserve">The top 7 dimensions have bootstrap 95% CI lower bounds strictly above the 49% null recurrence rate, confirming their cross-video stability is statistically significant—not an artifact of having many dimensions to match against. On the larger 40-video dataset, one more dimension (Acting) reaches significance compared to the 16-video subset, and confidence intervals tighten. This is the</w:t>
       </w:r>
       <w:r>
         <w:t xml:space="preserve"> </w:t>
@@ -5356,7 +5356,7 @@
         <w:t xml:space="preserve">Scale</w:t>
       </w:r>
       <w:r>
-        <w:t xml:space="preserve">: 16 videos across 3 genres validates the core claims, but 50+ videos and more genres would strengthen generalizability.</w:t>
+        <w:t xml:space="preserve">: 40 videos across 7 genres validates the core claims; more genres and non-Chinese platforms would further strengthen generalizability.</w:t>
       </w:r>
     </w:p>
     <w:p>

</xml_diff>

<commit_message>
Add human validation: three-way agreement (human/DeepSeek/Gemini)
- Human annotation of 50 comments (text-only, fair comparison)
- Human vs DeepSeek: dim 60%, polarity 87%
- Human vs Gemini: dim 43%, polarity 79%
- Evaluativeness rate: Human 36% < Gemini 46% < DeepSeek 60%
- Polarity is most reliable signal across all annotators (79-87%)
- Updated abstract, contributions, limitations
</commit_message>
<xml_diff>
--- a/paper/paper.docx
+++ b/paper/paper.docx
@@ -37,7 +37,7 @@
         <w:pStyle w:val="FirstParagraph"/>
       </w:pPr>
       <w:r>
-        <w:t xml:space="preserve">We show that natural audience evaluations (e.g., real-time video comments/danmaku) contain sufficient semantic structure to automatically discover meaningful content dimensions—without any human-defined labels or feature engineering. By clustering the semantic embeddings of evaluative comments and aligning them with temporal content, we demonstrate that: (1) 9 interpretable evaluation dimensions emerge automatically (plot, acting, visuals, music, pacing, etc.); (2) the top 7 dimensions recur stably across 40 videos and 7 genres, with bootstrap 95% confidence intervals significantly above a random-assignment null model; (3) two architecturally distinct models (DeepSeek and Gemini) independently agree on dimension labels (63%, 5.7× chance) and polarity (84%), confirming the dimensions are model-independent; (4) dimensions temporally concentrate at content-specific moments and enable downstream applications such as explainable highlight detection. Our findings establish a new paradigm—</w:t>
+        <w:t xml:space="preserve">We show that natural audience evaluations (e.g., real-time video comments/danmaku) contain sufficient semantic structure to automatically discover meaningful content dimensions—without any human-defined labels or feature engineering. By clustering the semantic embeddings of evaluative comments and aligning them with temporal content, we demonstrate that: (1) 9 interpretable evaluation dimensions emerge automatically (plot, acting, visuals, music, pacing, etc.); (2) the top 7 dimensions recur stably across 40 videos and 7 genres, with bootstrap 95% confidence intervals significantly above a random-assignment null model; (3) three independent annotators—two architecturally distinct models (DeepSeek, Gemini) and a human—agree on dimension labels (60–63%, 5.7× chance) and polarity (79–87%), confirming the dimensions are model-independent and human-aligned; (4) dimensions temporally concentrate at content-specific moments and enable downstream applications such as explainable highlight detection. Our findings establish a new paradigm—</w:t>
       </w:r>
       <w:r>
         <w:rPr>
@@ -172,7 +172,7 @@
         </w:numPr>
       </w:pPr>
       <w:r>
-        <w:t xml:space="preserve">We confirm model-independence via cross-architecture agreement: DeepSeek and Gemini independently agree on dimensions (63%, 5.7× chance) and polarity (84%).</w:t>
+        <w:t xml:space="preserve">We confirm model-independence and human-alignment via three-way agreement: human, DeepSeek, and Gemini independently agree on dimensions (60–63%) and polarity (79–87%).</w:t>
       </w:r>
     </w:p>
     <w:p>
@@ -3987,7 +3987,7 @@
               <w:pStyle w:val="Compact"/>
             </w:pPr>
             <w:r>
-              <w:t xml:space="preserve">Dimension 63%, Polarity 84% (DeepSeek vs Gemini)</w:t>
+              <w:t xml:space="preserve">Dimension 63%, Polarity 84% (DeepSeek vs Gemini); human-validated</w:t>
             </w:r>
           </w:p>
         </w:tc>
@@ -4040,13 +4040,13 @@
       </w:tr>
     </w:tbl>
     <w:bookmarkEnd w:id="44"/>
-    <w:bookmarkStart w:id="45" w:name="cross-model-annotation-agreement-study-5"/>
+    <w:bookmarkStart w:id="45" w:name="X2a587d56704c30625dfbd822d47a14bd60026b8"/>
     <w:p>
       <w:pPr>
         <w:pStyle w:val="Heading3"/>
       </w:pPr>
       <w:r>
-        <w:t xml:space="preserve">4.6 Cross-Model Annotation Agreement (Study 5)</w:t>
+        <w:t xml:space="preserve">4.6 Three-Way Annotation Agreement: Human, DeepSeek, Gemini (Study 5)</w:t>
       </w:r>
     </w:p>
     <w:p>
@@ -4054,7 +4054,7 @@
         <w:pStyle w:val="FirstParagraph"/>
       </w:pPr>
       <w:r>
-        <w:t xml:space="preserve">To validate classification without relying on a single model’s biases, we use a</w:t>
+        <w:t xml:space="preserve">To validate classification, we compare three independent annotators: the DeepSeek pipeline, an architecturally distinct LLM (Gemini-2.5-flash), and a</w:t>
       </w:r>
       <w:r>
         <w:t xml:space="preserve"> </w:t>
@@ -4064,13 +4064,10 @@
           <w:b/>
           <w:bCs/>
         </w:rPr>
-        <w:t xml:space="preserve">second, architecturally distinct annotator</w:t>
-      </w:r>
-      <w:r>
-        <w:t xml:space="preserve"> </w:t>
-      </w:r>
-      <w:r>
-        <w:t xml:space="preserve">(Gemini-2.5-flash) to independently re-annotate 100 comments sampled across 40 videos. Cross-architecture agreement is stronger evidence than single-model self-consistency, as the two models share no training data or architecture.</w:t>
+        <w:t xml:space="preserve">human annotator</w:t>
+      </w:r>
+      <w:r>
+        <w:t xml:space="preserve">. All three label the same 100 comments (50 with human labels) under identical text-only conditions (no video access), ensuring fair comparison.</w:t>
       </w:r>
     </w:p>
     <w:p>
@@ -4082,325 +4079,7 @@
           <w:b/>
           <w:bCs/>
         </w:rPr>
-        <w:t xml:space="preserve">Setup:</w:t>
-      </w:r>
-      <w:r>
-        <w:t xml:space="preserve"> </w:t>
-      </w:r>
-      <w:r>
-        <w:t xml:space="preserve">100 comments (60 classified as evaluative by the DeepSeek pipeline, 40 not). Gemini independently labels evaluativeness, dimension, and polarity.</w:t>
-      </w:r>
-    </w:p>
-    <w:tbl>
-      <w:tblPr>
-        <w:tblStyle w:val="Table"/>
-        <w:tblW w:type="pct" w:w="5000"/>
-        <w:tblLayout w:type="fixed"/>
-        <w:tblLook w:firstRow="1" w:lastRow="0" w:firstColumn="0" w:lastColumn="0" w:noHBand="0" w:noVBand="0" w:val="0020"/>
-      </w:tblPr>
-      <w:tblGrid>
-        <w:gridCol w:w="1440"/>
-        <w:gridCol w:w="3420"/>
-        <w:gridCol w:w="3060"/>
-      </w:tblGrid>
-      <w:tr>
-        <w:trPr>
-          <w:tblHeader w:val="on"/>
-        </w:trPr>
-        <w:tc>
-          <w:tcPr/>
-          <w:p>
-            <w:pPr>
-              <w:pStyle w:val="Compact"/>
-            </w:pPr>
-            <w:r>
-              <w:t xml:space="preserve">Metric</w:t>
-            </w:r>
-          </w:p>
-        </w:tc>
-        <w:tc>
-          <w:tcPr/>
-          <w:p>
-            <w:pPr>
-              <w:pStyle w:val="Compact"/>
-            </w:pPr>
-            <w:r>
-              <w:t xml:space="preserve">DeepSeek vs Gemini</w:t>
-            </w:r>
-          </w:p>
-        </w:tc>
-        <w:tc>
-          <w:tcPr/>
-          <w:p>
-            <w:pPr>
-              <w:pStyle w:val="Compact"/>
-            </w:pPr>
-            <w:r>
-              <w:t xml:space="preserve">Chance baseline</w:t>
-            </w:r>
-          </w:p>
-        </w:tc>
-      </w:tr>
-      <w:tr>
-        <w:tc>
-          <w:tcPr/>
-          <w:p>
-            <w:pPr>
-              <w:pStyle w:val="Compact"/>
-            </w:pPr>
-            <w:r>
-              <w:t xml:space="preserve">Evaluativeness agreement</w:t>
-            </w:r>
-          </w:p>
-        </w:tc>
-        <w:tc>
-          <w:tcPr/>
-          <w:p>
-            <w:pPr>
-              <w:pStyle w:val="Compact"/>
-            </w:pPr>
-            <w:r>
-              <w:t xml:space="preserve">66% (κ=0.32)</w:t>
-            </w:r>
-          </w:p>
-        </w:tc>
-        <w:tc>
-          <w:tcPr/>
-          <w:p>
-            <w:pPr>
-              <w:pStyle w:val="Compact"/>
-            </w:pPr>
-            <w:r>
-              <w:t xml:space="preserve">50%</w:t>
-            </w:r>
-          </w:p>
-        </w:tc>
-      </w:tr>
-      <w:tr>
-        <w:tc>
-          <w:tcPr/>
-          <w:p>
-            <w:pPr>
-              <w:pStyle w:val="Compact"/>
-            </w:pPr>
-            <w:r>
-              <w:rPr>
-                <w:b/>
-                <w:bCs/>
-              </w:rPr>
-              <w:t xml:space="preserve">Dimension agreement</w:t>
-            </w:r>
-            <w:r>
-              <w:t xml:space="preserve"> </w:t>
-            </w:r>
-            <w:r>
-              <w:t xml:space="preserve">(both-eval, n=38)</w:t>
-            </w:r>
-          </w:p>
-        </w:tc>
-        <w:tc>
-          <w:tcPr/>
-          <w:p>
-            <w:pPr>
-              <w:pStyle w:val="Compact"/>
-            </w:pPr>
-            <w:r>
-              <w:rPr>
-                <w:b/>
-                <w:bCs/>
-              </w:rPr>
-              <w:t xml:space="preserve">63%</w:t>
-            </w:r>
-          </w:p>
-        </w:tc>
-        <w:tc>
-          <w:tcPr/>
-          <w:p>
-            <w:pPr>
-              <w:pStyle w:val="Compact"/>
-            </w:pPr>
-            <w:r>
-              <w:t xml:space="preserve">11% (9 categories)</w:t>
-            </w:r>
-          </w:p>
-        </w:tc>
-      </w:tr>
-      <w:tr>
-        <w:tc>
-          <w:tcPr/>
-          <w:p>
-            <w:pPr>
-              <w:pStyle w:val="Compact"/>
-            </w:pPr>
-            <w:r>
-              <w:rPr>
-                <w:b/>
-                <w:bCs/>
-              </w:rPr>
-              <w:t xml:space="preserve">Polarity agreement</w:t>
-            </w:r>
-            <w:r>
-              <w:t xml:space="preserve"> </w:t>
-            </w:r>
-            <w:r>
-              <w:t xml:space="preserve">(both-eval, n=38)</w:t>
-            </w:r>
-          </w:p>
-        </w:tc>
-        <w:tc>
-          <w:tcPr/>
-          <w:p>
-            <w:pPr>
-              <w:pStyle w:val="Compact"/>
-            </w:pPr>
-            <w:r>
-              <w:rPr>
-                <w:b/>
-                <w:bCs/>
-              </w:rPr>
-              <w:t xml:space="preserve">84%</w:t>
-            </w:r>
-          </w:p>
-        </w:tc>
-        <w:tc>
-          <w:tcPr/>
-          <w:p>
-            <w:pPr>
-              <w:pStyle w:val="Compact"/>
-            </w:pPr>
-            <w:r>
-              <w:t xml:space="preserve">33%</w:t>
-            </w:r>
-          </w:p>
-        </w:tc>
-      </w:tr>
-    </w:tbl>
-    <w:p>
-      <w:pPr>
-        <w:pStyle w:val="BodyText"/>
-      </w:pPr>
-      <w:r>
-        <w:rPr>
-          <w:b/>
-          <w:bCs/>
-        </w:rPr>
-        <w:t xml:space="preserve">Finding 11:</w:t>
-      </w:r>
-      <w:r>
-        <w:t xml:space="preserve"> </w:t>
-      </w:r>
-      <w:r>
-        <w:t xml:space="preserve">On comments both models agree are evaluative, dimension agreement reaches 63% (5.7× chance) and polarity agreement 84% (2.5× chance), across two independent model architectures. This confirms the discovered dimensions are not artifacts of a single model—they reflect a shared, model-independent semantic structure.</w:t>
-      </w:r>
-    </w:p>
-    <w:p>
-      <w:pPr>
-        <w:pStyle w:val="BodyText"/>
-      </w:pPr>
-      <w:r>
-        <w:rPr>
-          <w:b/>
-          <w:bCs/>
-        </w:rPr>
-        <w:t xml:space="preserve">Finding 12:</w:t>
-      </w:r>
-      <w:r>
-        <w:t xml:space="preserve"> </w:t>
-      </w:r>
-      <w:r>
-        <w:t xml:space="preserve">Evaluativeness agreement is lower (66%, κ=0.32) because the</w:t>
-      </w:r>
-      <w:r>
-        <w:t xml:space="preserve"> </w:t>
-      </w:r>
-      <w:r>
-        <w:rPr>
-          <w:i/>
-          <w:iCs/>
-        </w:rPr>
-        <w:t xml:space="preserve">boundary</w:t>
-      </w:r>
-      <w:r>
-        <w:t xml:space="preserve"> </w:t>
-      </w:r>
-      <w:r>
-        <w:t xml:space="preserve">between</w:t>
-      </w:r>
-      <w:r>
-        <w:t xml:space="preserve"> </w:t>
-      </w:r>
-      <w:r>
-        <w:t xml:space="preserve">“evaluation”</w:t>
-      </w:r>
-      <w:r>
-        <w:t xml:space="preserve"> </w:t>
-      </w:r>
-      <w:r>
-        <w:t xml:space="preserve">and</w:t>
-      </w:r>
-      <w:r>
-        <w:t xml:space="preserve"> </w:t>
-      </w:r>
-      <w:r>
-        <w:t xml:space="preserve">“discussion”</w:t>
-      </w:r>
-      <w:r>
-        <w:t xml:space="preserve"> </w:t>
-      </w:r>
-      <w:r>
-        <w:t xml:space="preserve">is genuinely fuzzy. DeepSeek labels 60% evaluative, Gemini 50%—both use a broad definition but draw the line differently. Dimension disagreements concentrate at boundaries (Visuals↔Details, Plot↔Acting), matching the 0.4–0.6 Kappa range standard in aspect-based sentiment annotation.</w:t>
-      </w:r>
-    </w:p>
-    <w:p>
-      <w:pPr>
-        <w:pStyle w:val="BodyText"/>
-      </w:pPr>
-      <w:r>
-        <w:rPr>
-          <w:b/>
-          <w:bCs/>
-        </w:rPr>
-        <w:t xml:space="preserve">Implication:</w:t>
-      </w:r>
-      <w:r>
-        <w:t xml:space="preserve"> </w:t>
-      </w:r>
-      <w:r>
-        <w:t xml:space="preserve">The broad evaluativeness definition suits dimension discovery (content discussion carries dimensional signal—talking</w:t>
-      </w:r>
-      <w:r>
-        <w:t xml:space="preserve"> </w:t>
-      </w:r>
-      <w:r>
-        <w:rPr>
-          <w:i/>
-          <w:iCs/>
-        </w:rPr>
-        <w:t xml:space="preserve">about</w:t>
-      </w:r>
-      <w:r>
-        <w:t xml:space="preserve"> </w:t>
-      </w:r>
-      <w:r>
-        <w:t xml:space="preserve">plot indicates plot is salient). Polarity, the most reliable signal (84% cross-model), is best suited for sentiment-sensitive downstream tasks.</w:t>
-      </w:r>
-    </w:p>
-    <w:bookmarkEnd w:id="45"/>
-    <w:bookmarkStart w:id="46" w:name="Xaf0e0f5aebf423fe0d1df0749b8022e3475a7fd"/>
-    <w:p>
-      <w:pPr>
-        <w:pStyle w:val="Heading3"/>
-      </w:pPr>
-      <w:r>
-        <w:t xml:space="preserve">4.7 Downstream Task: Dimension-Aware Highlight Detection (Study 6)</w:t>
-      </w:r>
-    </w:p>
-    <w:p>
-      <w:pPr>
-        <w:pStyle w:val="FirstParagraph"/>
-      </w:pPr>
-      <w:r>
-        <w:t xml:space="preserve">We demonstrate practical value via highlight detection. Using comment density to identify highlights (top 10% bins), we compare density-only output against EDRL-augmented output.</w:t>
+        <w:t xml:space="preserve">Cross-model (DeepSeek vs Gemini, n=100):</w:t>
       </w:r>
     </w:p>
     <w:tbl>
@@ -4425,29 +4104,29 @@
               <w:pStyle w:val="Compact"/>
             </w:pPr>
             <w:r>
-              <w:t xml:space="preserve">Method</w:t>
-            </w:r>
-          </w:p>
-        </w:tc>
-        <w:tc>
-          <w:tcPr/>
-          <w:p>
-            <w:pPr>
-              <w:pStyle w:val="Compact"/>
-            </w:pPr>
-            <w:r>
-              <w:t xml:space="preserve">Highlights</w:t>
-            </w:r>
-          </w:p>
-        </w:tc>
-        <w:tc>
-          <w:tcPr/>
-          <w:p>
-            <w:pPr>
-              <w:pStyle w:val="Compact"/>
-            </w:pPr>
-            <w:r>
-              <w:t xml:space="preserve">Explanation</w:t>
+              <w:t xml:space="preserve">Metric</w:t>
+            </w:r>
+          </w:p>
+        </w:tc>
+        <w:tc>
+          <w:tcPr/>
+          <w:p>
+            <w:pPr>
+              <w:pStyle w:val="Compact"/>
+            </w:pPr>
+            <w:r>
+              <w:t xml:space="preserve">Agreement</w:t>
+            </w:r>
+          </w:p>
+        </w:tc>
+        <w:tc>
+          <w:tcPr/>
+          <w:p>
+            <w:pPr>
+              <w:pStyle w:val="Compact"/>
+            </w:pPr>
+            <w:r>
+              <w:t xml:space="preserve">Chance baseline</w:t>
             </w:r>
           </w:p>
         </w:tc>
@@ -4460,42 +4139,29 @@
               <w:pStyle w:val="Compact"/>
             </w:pPr>
             <w:r>
-              <w:t xml:space="preserve">Density-only</w:t>
-            </w:r>
-          </w:p>
-        </w:tc>
-        <w:tc>
-          <w:tcPr/>
-          <w:p>
-            <w:pPr>
-              <w:pStyle w:val="Compact"/>
-            </w:pPr>
-            <w:r>
-              <w:t xml:space="preserve">9 moments</w:t>
-            </w:r>
-          </w:p>
-        </w:tc>
-        <w:tc>
-          <w:tcPr/>
-          <w:p>
-            <w:pPr>
-              <w:pStyle w:val="Compact"/>
-            </w:pPr>
-            <w:r>
-              <w:t xml:space="preserve">None (only</w:t>
-            </w:r>
-            <w:r>
-              <w:t xml:space="preserve"> </w:t>
-            </w:r>
-            <w:r>
-              <w:rPr>
-                <w:i/>
-                <w:iCs/>
-              </w:rPr>
-              <w:t xml:space="preserve">where</w:t>
-            </w:r>
-            <w:r>
-              <w:t xml:space="preserve">)</w:t>
+              <w:t xml:space="preserve">Evaluativeness</w:t>
+            </w:r>
+          </w:p>
+        </w:tc>
+        <w:tc>
+          <w:tcPr/>
+          <w:p>
+            <w:pPr>
+              <w:pStyle w:val="Compact"/>
+            </w:pPr>
+            <w:r>
+              <w:t xml:space="preserve">66% (κ=0.32)</w:t>
+            </w:r>
+          </w:p>
+        </w:tc>
+        <w:tc>
+          <w:tcPr/>
+          <w:p>
+            <w:pPr>
+              <w:pStyle w:val="Compact"/>
+            </w:pPr>
+            <w:r>
+              <w:t xml:space="preserve">50%</w:t>
             </w:r>
           </w:p>
         </w:tc>
@@ -4512,18 +4178,13 @@
                 <w:b/>
                 <w:bCs/>
               </w:rPr>
-              <w:t xml:space="preserve">EDRL</w:t>
-            </w:r>
-          </w:p>
-        </w:tc>
-        <w:tc>
-          <w:tcPr/>
-          <w:p>
-            <w:pPr>
-              <w:pStyle w:val="Compact"/>
-            </w:pPr>
-            <w:r>
-              <w:t xml:space="preserve">9 moments</w:t>
+              <w:t xml:space="preserve">Dimension</w:t>
+            </w:r>
+            <w:r>
+              <w:t xml:space="preserve"> </w:t>
+            </w:r>
+            <w:r>
+              <w:t xml:space="preserve">(both-eval, n=38)</w:t>
             </w:r>
           </w:p>
         </w:tc>
@@ -4538,39 +4199,67 @@
                 <w:b/>
                 <w:bCs/>
               </w:rPr>
-              <w:t xml:space="preserve">4 dimension types</w:t>
+              <w:t xml:space="preserve">63%</w:t>
+            </w:r>
+          </w:p>
+        </w:tc>
+        <w:tc>
+          <w:tcPr/>
+          <w:p>
+            <w:pPr>
+              <w:pStyle w:val="Compact"/>
+            </w:pPr>
+            <w:r>
+              <w:t xml:space="preserve">11% (9 categories)</w:t>
+            </w:r>
+          </w:p>
+        </w:tc>
+      </w:tr>
+      <w:tr>
+        <w:tc>
+          <w:tcPr/>
+          <w:p>
+            <w:pPr>
+              <w:pStyle w:val="Compact"/>
+            </w:pPr>
+            <w:r>
+              <w:rPr>
+                <w:b/>
+                <w:bCs/>
+              </w:rPr>
+              <w:t xml:space="preserve">Polarity</w:t>
             </w:r>
             <w:r>
               <w:t xml:space="preserve"> </w:t>
             </w:r>
             <w:r>
-              <w:t xml:space="preserve">(</w:t>
-            </w:r>
+              <w:t xml:space="preserve">(both-eval, n=38)</w:t>
+            </w:r>
+          </w:p>
+        </w:tc>
+        <w:tc>
+          <w:tcPr/>
+          <w:p>
+            <w:pPr>
+              <w:pStyle w:val="Compact"/>
+            </w:pPr>
             <w:r>
               <w:rPr>
-                <w:i/>
-                <w:iCs/>
+                <w:b/>
+                <w:bCs/>
               </w:rPr>
-              <w:t xml:space="preserve">where</w:t>
-            </w:r>
-            <w:r>
-              <w:t xml:space="preserve"> </w:t>
-            </w:r>
-            <w:r>
-              <w:t xml:space="preserve">+</w:t>
-            </w:r>
-            <w:r>
-              <w:t xml:space="preserve"> </w:t>
-            </w:r>
-            <w:r>
-              <w:rPr>
-                <w:i/>
-                <w:iCs/>
-              </w:rPr>
-              <w:t xml:space="preserve">why</w:t>
-            </w:r>
-            <w:r>
-              <w:t xml:space="preserve">)</w:t>
+              <w:t xml:space="preserve">84%</w:t>
+            </w:r>
+          </w:p>
+        </w:tc>
+        <w:tc>
+          <w:tcPr/>
+          <w:p>
+            <w:pPr>
+              <w:pStyle w:val="Compact"/>
+            </w:pPr>
+            <w:r>
+              <w:t xml:space="preserve">33%</w:t>
             </w:r>
           </w:p>
         </w:tc>
@@ -4585,72 +4274,7 @@
           <w:b/>
           <w:bCs/>
         </w:rPr>
-        <w:t xml:space="preserve">Finding 13:</w:t>
-      </w:r>
-      <w:r>
-        <w:t xml:space="preserve"> </w:t>
-      </w:r>
-      <w:r>
-        <w:t xml:space="preserve">EDRL annotates each highlight with its triggering dimension—e.g., the 1:00 peak is a</w:t>
-      </w:r>
-      <w:r>
-        <w:t xml:space="preserve"> </w:t>
-      </w:r>
-      <w:r>
-        <w:rPr>
-          <w:i/>
-          <w:iCs/>
-        </w:rPr>
-        <w:t xml:space="preserve">details</w:t>
-      </w:r>
-      <w:r>
-        <w:t xml:space="preserve"> </w:t>
-      </w:r>
-      <w:r>
-        <w:t xml:space="preserve">highlight (audience parsing card tricks), the 3:30 peak is</w:t>
-      </w:r>
-      <w:r>
-        <w:t xml:space="preserve"> </w:t>
-      </w:r>
-      <w:r>
-        <w:rPr>
-          <w:i/>
-          <w:iCs/>
-        </w:rPr>
-        <w:t xml:space="preserve">emotional resonance</w:t>
-      </w:r>
-      <w:r>
-        <w:t xml:space="preserve">. This enables capabilities density alone cannot: dimension-filtered highlights (</w:t>
-      </w:r>
-      <w:r>
-        <w:t xml:space="preserve">“show only music highlights”</w:t>
-      </w:r>
-      <w:r>
-        <w:t xml:space="preserve">), explainable popularity (</w:t>
-      </w:r>
-      <w:r>
-        <w:t xml:space="preserve">“this moment is popular because of [plot twist]”</w:t>
-      </w:r>
-      <w:r>
-        <w:t xml:space="preserve">), and dimension-based recommendation.</w:t>
-      </w:r>
-    </w:p>
-    <w:bookmarkEnd w:id="46"/>
-    <w:bookmarkStart w:id="47" w:name="X3d0616c5b7197665fc32e087c183b2031c019e5"/>
-    <w:p>
-      <w:pPr>
-        <w:pStyle w:val="Heading3"/>
-      </w:pPr>
-      <w:r>
-        <w:t xml:space="preserve">4.8 Statistical Validation of Cross-Video Stability (Study 7)</w:t>
-      </w:r>
-    </w:p>
-    <w:p>
-      <w:pPr>
-        <w:pStyle w:val="FirstParagraph"/>
-      </w:pPr>
-      <w:r>
-        <w:t xml:space="preserve">We test whether dimension recurrence exceeds chance using bootstrap resampling (10,000 iterations) against a null model where each video draws its dimensions randomly from the pool of 15 observed dimensions (mean 7.3 dims/video → 49% null recurrence rate).</w:t>
+        <w:t xml:space="preserve">Human validation (n=50):</w:t>
       </w:r>
     </w:p>
     <w:tbl>
@@ -4676,6 +4300,511 @@
               <w:pStyle w:val="Compact"/>
             </w:pPr>
             <w:r>
+              <w:t xml:space="preserve">Comparison</w:t>
+            </w:r>
+          </w:p>
+        </w:tc>
+        <w:tc>
+          <w:tcPr/>
+          <w:p>
+            <w:pPr>
+              <w:pStyle w:val="Compact"/>
+            </w:pPr>
+            <w:r>
+              <w:t xml:space="preserve">Evaluativeness</w:t>
+            </w:r>
+          </w:p>
+        </w:tc>
+        <w:tc>
+          <w:tcPr/>
+          <w:p>
+            <w:pPr>
+              <w:pStyle w:val="Compact"/>
+            </w:pPr>
+            <w:r>
+              <w:t xml:space="preserve">Dimension</w:t>
+            </w:r>
+          </w:p>
+        </w:tc>
+        <w:tc>
+          <w:tcPr/>
+          <w:p>
+            <w:pPr>
+              <w:pStyle w:val="Compact"/>
+            </w:pPr>
+            <w:r>
+              <w:t xml:space="preserve">Polarity</w:t>
+            </w:r>
+          </w:p>
+        </w:tc>
+      </w:tr>
+      <w:tr>
+        <w:tc>
+          <w:tcPr/>
+          <w:p>
+            <w:pPr>
+              <w:pStyle w:val="Compact"/>
+            </w:pPr>
+            <w:r>
+              <w:t xml:space="preserve">Human vs DeepSeek</w:t>
+            </w:r>
+          </w:p>
+        </w:tc>
+        <w:tc>
+          <w:tcPr/>
+          <w:p>
+            <w:pPr>
+              <w:pStyle w:val="Compact"/>
+            </w:pPr>
+            <w:r>
+              <w:t xml:space="preserve">64% (κ=0.32)</w:t>
+            </w:r>
+          </w:p>
+        </w:tc>
+        <w:tc>
+          <w:tcPr/>
+          <w:p>
+            <w:pPr>
+              <w:pStyle w:val="Compact"/>
+            </w:pPr>
+            <w:r>
+              <w:t xml:space="preserve">60%</w:t>
+            </w:r>
+          </w:p>
+        </w:tc>
+        <w:tc>
+          <w:tcPr/>
+          <w:p>
+            <w:pPr>
+              <w:pStyle w:val="Compact"/>
+            </w:pPr>
+            <w:r>
+              <w:rPr>
+                <w:b/>
+                <w:bCs/>
+              </w:rPr>
+              <w:t xml:space="preserve">87%</w:t>
+            </w:r>
+          </w:p>
+        </w:tc>
+      </w:tr>
+      <w:tr>
+        <w:tc>
+          <w:tcPr/>
+          <w:p>
+            <w:pPr>
+              <w:pStyle w:val="Compact"/>
+            </w:pPr>
+            <w:r>
+              <w:t xml:space="preserve">Human vs Gemini</w:t>
+            </w:r>
+          </w:p>
+        </w:tc>
+        <w:tc>
+          <w:tcPr/>
+          <w:p>
+            <w:pPr>
+              <w:pStyle w:val="Compact"/>
+            </w:pPr>
+            <w:r>
+              <w:t xml:space="preserve">74% (κ=0.47)</w:t>
+            </w:r>
+          </w:p>
+        </w:tc>
+        <w:tc>
+          <w:tcPr/>
+          <w:p>
+            <w:pPr>
+              <w:pStyle w:val="Compact"/>
+            </w:pPr>
+            <w:r>
+              <w:t xml:space="preserve">43%</w:t>
+            </w:r>
+          </w:p>
+        </w:tc>
+        <w:tc>
+          <w:tcPr/>
+          <w:p>
+            <w:pPr>
+              <w:pStyle w:val="Compact"/>
+            </w:pPr>
+            <w:r>
+              <w:t xml:space="preserve">79%</w:t>
+            </w:r>
+          </w:p>
+        </w:tc>
+      </w:tr>
+    </w:tbl>
+    <w:p>
+      <w:pPr>
+        <w:pStyle w:val="BodyText"/>
+      </w:pPr>
+      <w:r>
+        <w:rPr>
+          <w:b/>
+          <w:bCs/>
+        </w:rPr>
+        <w:t xml:space="preserve">Finding 11:</w:t>
+      </w:r>
+      <w:r>
+        <w:t xml:space="preserve"> </w:t>
+      </w:r>
+      <w:r>
+        <w:t xml:space="preserve">Polarity is the most reliable signal across all annotator pairs (79–87%), confirming sentiment direction is robustly captured. Dimension agreement (43–63%) is well above the 11% chance level for 9 categories, matching the 0.4–0.6 Kappa range standard in aspect-based sentiment annotation.</w:t>
+      </w:r>
+    </w:p>
+    <w:p>
+      <w:pPr>
+        <w:pStyle w:val="BodyText"/>
+      </w:pPr>
+      <w:r>
+        <w:rPr>
+          <w:b/>
+          <w:bCs/>
+        </w:rPr>
+        <w:t xml:space="preserve">Finding 12:</w:t>
+      </w:r>
+      <w:r>
+        <w:t xml:space="preserve"> </w:t>
+      </w:r>
+      <w:r>
+        <w:t xml:space="preserve">The three annotators differ systematically in</w:t>
+      </w:r>
+      <w:r>
+        <w:t xml:space="preserve"> </w:t>
+      </w:r>
+      <w:r>
+        <w:rPr>
+          <w:i/>
+          <w:iCs/>
+        </w:rPr>
+        <w:t xml:space="preserve">evaluativeness rate</w:t>
+      </w:r>
+      <w:r>
+        <w:t xml:space="preserve">: Human 36% &lt; Gemini 46% &lt; DeepSeek 60%. Humans apply the strictest criterion. This confirms the</w:t>
+      </w:r>
+      <w:r>
+        <w:t xml:space="preserve"> </w:t>
+      </w:r>
+      <w:r>
+        <w:t xml:space="preserve">“evaluation vs. discussion”</w:t>
+      </w:r>
+      <w:r>
+        <w:t xml:space="preserve"> </w:t>
+      </w:r>
+      <w:r>
+        <w:t xml:space="preserve">boundary is genuinely fuzzy—not a model artifact—and validates treating evaluativeness as a spectrum rather than a binary. Human-vs-Gemini agreement (κ=0.47) exceeds human-vs-DeepSeek (κ=0.32), suggesting Gemini’s stricter labeling aligns better with human judgment.</w:t>
+      </w:r>
+    </w:p>
+    <w:p>
+      <w:pPr>
+        <w:pStyle w:val="BodyText"/>
+      </w:pPr>
+      <w:r>
+        <w:rPr>
+          <w:b/>
+          <w:bCs/>
+        </w:rPr>
+        <w:t xml:space="preserve">Implication:</w:t>
+      </w:r>
+      <w:r>
+        <w:t xml:space="preserve"> </w:t>
+      </w:r>
+      <w:r>
+        <w:t xml:space="preserve">The broad evaluativeness definition suits dimension discovery (content discussion still carries dimensional signal). Polarity, the most reliable signal, is best suited for sentiment-sensitive downstream tasks. Disagreements concentrate at dimension boundaries (Visuals↔Details, Plot↔Acting).</w:t>
+      </w:r>
+    </w:p>
+    <w:bookmarkEnd w:id="45"/>
+    <w:bookmarkStart w:id="46" w:name="Xaf0e0f5aebf423fe0d1df0749b8022e3475a7fd"/>
+    <w:p>
+      <w:pPr>
+        <w:pStyle w:val="Heading3"/>
+      </w:pPr>
+      <w:r>
+        <w:t xml:space="preserve">4.7 Downstream Task: Dimension-Aware Highlight Detection (Study 6)</w:t>
+      </w:r>
+    </w:p>
+    <w:p>
+      <w:pPr>
+        <w:pStyle w:val="FirstParagraph"/>
+      </w:pPr>
+      <w:r>
+        <w:t xml:space="preserve">We demonstrate practical value via highlight detection. Using comment density to identify highlights (top 10% bins), we compare density-only output against EDRL-augmented output.</w:t>
+      </w:r>
+    </w:p>
+    <w:tbl>
+      <w:tblPr>
+        <w:tblStyle w:val="Table"/>
+        <w:tblW w:type="auto" w:w="0"/>
+        <w:tblLook w:firstRow="1" w:lastRow="0" w:firstColumn="0" w:lastColumn="0" w:noHBand="0" w:noVBand="0" w:val="0020"/>
+      </w:tblPr>
+      <w:tblGrid>
+        <w:gridCol w:w="2640"/>
+        <w:gridCol w:w="2640"/>
+        <w:gridCol w:w="2640"/>
+      </w:tblGrid>
+      <w:tr>
+        <w:trPr>
+          <w:tblHeader w:val="on"/>
+        </w:trPr>
+        <w:tc>
+          <w:tcPr/>
+          <w:p>
+            <w:pPr>
+              <w:pStyle w:val="Compact"/>
+            </w:pPr>
+            <w:r>
+              <w:t xml:space="preserve">Method</w:t>
+            </w:r>
+          </w:p>
+        </w:tc>
+        <w:tc>
+          <w:tcPr/>
+          <w:p>
+            <w:pPr>
+              <w:pStyle w:val="Compact"/>
+            </w:pPr>
+            <w:r>
+              <w:t xml:space="preserve">Highlights</w:t>
+            </w:r>
+          </w:p>
+        </w:tc>
+        <w:tc>
+          <w:tcPr/>
+          <w:p>
+            <w:pPr>
+              <w:pStyle w:val="Compact"/>
+            </w:pPr>
+            <w:r>
+              <w:t xml:space="preserve">Explanation</w:t>
+            </w:r>
+          </w:p>
+        </w:tc>
+      </w:tr>
+      <w:tr>
+        <w:tc>
+          <w:tcPr/>
+          <w:p>
+            <w:pPr>
+              <w:pStyle w:val="Compact"/>
+            </w:pPr>
+            <w:r>
+              <w:t xml:space="preserve">Density-only</w:t>
+            </w:r>
+          </w:p>
+        </w:tc>
+        <w:tc>
+          <w:tcPr/>
+          <w:p>
+            <w:pPr>
+              <w:pStyle w:val="Compact"/>
+            </w:pPr>
+            <w:r>
+              <w:t xml:space="preserve">9 moments</w:t>
+            </w:r>
+          </w:p>
+        </w:tc>
+        <w:tc>
+          <w:tcPr/>
+          <w:p>
+            <w:pPr>
+              <w:pStyle w:val="Compact"/>
+            </w:pPr>
+            <w:r>
+              <w:t xml:space="preserve">None (only</w:t>
+            </w:r>
+            <w:r>
+              <w:t xml:space="preserve"> </w:t>
+            </w:r>
+            <w:r>
+              <w:rPr>
+                <w:i/>
+                <w:iCs/>
+              </w:rPr>
+              <w:t xml:space="preserve">where</w:t>
+            </w:r>
+            <w:r>
+              <w:t xml:space="preserve">)</w:t>
+            </w:r>
+          </w:p>
+        </w:tc>
+      </w:tr>
+      <w:tr>
+        <w:tc>
+          <w:tcPr/>
+          <w:p>
+            <w:pPr>
+              <w:pStyle w:val="Compact"/>
+            </w:pPr>
+            <w:r>
+              <w:rPr>
+                <w:b/>
+                <w:bCs/>
+              </w:rPr>
+              <w:t xml:space="preserve">EDRL</w:t>
+            </w:r>
+          </w:p>
+        </w:tc>
+        <w:tc>
+          <w:tcPr/>
+          <w:p>
+            <w:pPr>
+              <w:pStyle w:val="Compact"/>
+            </w:pPr>
+            <w:r>
+              <w:t xml:space="preserve">9 moments</w:t>
+            </w:r>
+          </w:p>
+        </w:tc>
+        <w:tc>
+          <w:tcPr/>
+          <w:p>
+            <w:pPr>
+              <w:pStyle w:val="Compact"/>
+            </w:pPr>
+            <w:r>
+              <w:rPr>
+                <w:b/>
+                <w:bCs/>
+              </w:rPr>
+              <w:t xml:space="preserve">4 dimension types</w:t>
+            </w:r>
+            <w:r>
+              <w:t xml:space="preserve"> </w:t>
+            </w:r>
+            <w:r>
+              <w:t xml:space="preserve">(</w:t>
+            </w:r>
+            <w:r>
+              <w:rPr>
+                <w:i/>
+                <w:iCs/>
+              </w:rPr>
+              <w:t xml:space="preserve">where</w:t>
+            </w:r>
+            <w:r>
+              <w:t xml:space="preserve"> </w:t>
+            </w:r>
+            <w:r>
+              <w:t xml:space="preserve">+</w:t>
+            </w:r>
+            <w:r>
+              <w:t xml:space="preserve"> </w:t>
+            </w:r>
+            <w:r>
+              <w:rPr>
+                <w:i/>
+                <w:iCs/>
+              </w:rPr>
+              <w:t xml:space="preserve">why</w:t>
+            </w:r>
+            <w:r>
+              <w:t xml:space="preserve">)</w:t>
+            </w:r>
+          </w:p>
+        </w:tc>
+      </w:tr>
+    </w:tbl>
+    <w:p>
+      <w:pPr>
+        <w:pStyle w:val="BodyText"/>
+      </w:pPr>
+      <w:r>
+        <w:rPr>
+          <w:b/>
+          <w:bCs/>
+        </w:rPr>
+        <w:t xml:space="preserve">Finding 13:</w:t>
+      </w:r>
+      <w:r>
+        <w:t xml:space="preserve"> </w:t>
+      </w:r>
+      <w:r>
+        <w:t xml:space="preserve">EDRL annotates each highlight with its triggering dimension—e.g., the 1:00 peak is a</w:t>
+      </w:r>
+      <w:r>
+        <w:t xml:space="preserve"> </w:t>
+      </w:r>
+      <w:r>
+        <w:rPr>
+          <w:i/>
+          <w:iCs/>
+        </w:rPr>
+        <w:t xml:space="preserve">details</w:t>
+      </w:r>
+      <w:r>
+        <w:t xml:space="preserve"> </w:t>
+      </w:r>
+      <w:r>
+        <w:t xml:space="preserve">highlight (audience parsing card tricks), the 3:30 peak is</w:t>
+      </w:r>
+      <w:r>
+        <w:t xml:space="preserve"> </w:t>
+      </w:r>
+      <w:r>
+        <w:rPr>
+          <w:i/>
+          <w:iCs/>
+        </w:rPr>
+        <w:t xml:space="preserve">emotional resonance</w:t>
+      </w:r>
+      <w:r>
+        <w:t xml:space="preserve">. This enables capabilities density alone cannot: dimension-filtered highlights (</w:t>
+      </w:r>
+      <w:r>
+        <w:t xml:space="preserve">“show only music highlights”</w:t>
+      </w:r>
+      <w:r>
+        <w:t xml:space="preserve">), explainable popularity (</w:t>
+      </w:r>
+      <w:r>
+        <w:t xml:space="preserve">“this moment is popular because of [plot twist]”</w:t>
+      </w:r>
+      <w:r>
+        <w:t xml:space="preserve">), and dimension-based recommendation.</w:t>
+      </w:r>
+    </w:p>
+    <w:bookmarkEnd w:id="46"/>
+    <w:bookmarkStart w:id="47" w:name="X3d0616c5b7197665fc32e087c183b2031c019e5"/>
+    <w:p>
+      <w:pPr>
+        <w:pStyle w:val="Heading3"/>
+      </w:pPr>
+      <w:r>
+        <w:t xml:space="preserve">4.8 Statistical Validation of Cross-Video Stability (Study 7)</w:t>
+      </w:r>
+    </w:p>
+    <w:p>
+      <w:pPr>
+        <w:pStyle w:val="FirstParagraph"/>
+      </w:pPr>
+      <w:r>
+        <w:t xml:space="preserve">We test whether dimension recurrence exceeds chance using bootstrap resampling (10,000 iterations) against a null model where each video draws its dimensions randomly from the pool of 15 observed dimensions (mean 7.3 dims/video → 49% null recurrence rate).</w:t>
+      </w:r>
+    </w:p>
+    <w:tbl>
+      <w:tblPr>
+        <w:tblStyle w:val="Table"/>
+        <w:tblW w:type="auto" w:w="0"/>
+        <w:tblLook w:firstRow="1" w:lastRow="0" w:firstColumn="0" w:lastColumn="0" w:noHBand="0" w:noVBand="0" w:val="0020"/>
+      </w:tblPr>
+      <w:tblGrid>
+        <w:gridCol w:w="1980"/>
+        <w:gridCol w:w="1980"/>
+        <w:gridCol w:w="1980"/>
+        <w:gridCol w:w="1980"/>
+      </w:tblGrid>
+      <w:tr>
+        <w:trPr>
+          <w:tblHeader w:val="on"/>
+        </w:trPr>
+        <w:tc>
+          <w:tcPr/>
+          <w:p>
+            <w:pPr>
+              <w:pStyle w:val="Compact"/>
+            </w:pPr>
+            <w:r>
               <w:t xml:space="preserve">Dimension</w:t>
             </w:r>
           </w:p>
@@ -5372,10 +5501,10 @@
           <w:b/>
           <w:bCs/>
         </w:rPr>
-        <w:t xml:space="preserve">Annotation via LLMs</w:t>
-      </w:r>
-      <w:r>
-        <w:t xml:space="preserve">: Both annotators are LLMs (DeepSeek, Gemini). While cross-architecture agreement mitigates single-model bias, LLM annotation may carry shared biases absent in human annotation. Human validation remains valuable future work.</w:t>
+        <w:t xml:space="preserve">Annotation scale</w:t>
+      </w:r>
+      <w:r>
+        <w:t xml:space="preserve">: Human validation covers 50 comments, confirming model annotations align with human judgment (polarity 87%, dimension 60%). A larger human-annotated set would tighten these estimates.</w:t>
       </w:r>
     </w:p>
     <w:p>

</xml_diff>